<commit_message>
Informe y presentacion con la interfaz web
- Seccion 7.4 del informe con capturas de la interfaz publicada en Render
- Interfaz agregada a arquitectura, documentacion, productos y anexos
- Diapositiva de la interfaz web en la presentacion
</commit_message>
<xml_diff>
--- a/docs/INFORME_FINAL_CHD_RENTAL_PRO_DSWII_Grupo10.docx
+++ b/docs/INFORME_FINAL_CHD_RENTAL_PRO_DSWII_Grupo10.docx
@@ -12,7 +12,7 @@
           <w:noProof/>
         </w:rPr>
         <w:drawing>
-          <wp:inline distT="0" distB="0" distL="0" distR="0" wp14:anchorId="1EEF4C05" wp14:editId="5D442D43">
+          <wp:inline distT="0" distB="0" distL="0" distR="0" wp14:anchorId="3F50888F" wp14:editId="0F93AB98">
             <wp:extent cx="1809750" cy="1171575"/>
             <wp:effectExtent l="0" t="0" r="0" b="0"/>
             <wp:docPr id="1" name="Imagen 1"/>
@@ -329,7 +329,7 @@
     <w:sdt>
       <w:sdtPr>
         <w:alias w:val="Contenido"/>
-        <w:id w:val="493767193"/>
+        <w:id w:val="-2140413313"/>
       </w:sdtPr>
       <w:sdtEndPr/>
       <w:sdtContent>
@@ -357,7 +357,7 @@
           <w:r>
             <w:fldChar w:fldCharType="separate"/>
           </w:r>
-          <w:hyperlink w:anchor="_Toc243371057" w:history="1">
+          <w:hyperlink w:anchor="_Toc243504108" w:history="1">
             <w:r>
               <w:rPr>
                 <w:rStyle w:val="Hipervnculo"/>
@@ -381,7 +381,7 @@
               <w:rPr>
                 <w:noProof/>
               </w:rPr>
-              <w:instrText xml:space="preserve"> PAGEREF _Toc243371057 \h </w:instrText>
+              <w:instrText xml:space="preserve"> PAGEREF _Toc243504108 \h </w:instrText>
             </w:r>
             <w:r>
               <w:rPr>
@@ -423,7 +423,7 @@
               <w14:ligatures w14:val="standardContextual"/>
             </w:rPr>
           </w:pPr>
-          <w:hyperlink w:anchor="_Toc243371058" w:history="1">
+          <w:hyperlink w:anchor="_Toc243504109" w:history="1">
             <w:r>
               <w:rPr>
                 <w:rStyle w:val="Hipervnculo"/>
@@ -447,7 +447,7 @@
               <w:rPr>
                 <w:noProof/>
               </w:rPr>
-              <w:instrText xml:space="preserve"> PAGEREF _Toc243371058 \h </w:instrText>
+              <w:instrText xml:space="preserve"> PAGEREF _Toc243504109 \h </w:instrText>
             </w:r>
             <w:r>
               <w:rPr>
@@ -489,7 +489,7 @@
               <w14:ligatures w14:val="standardContextual"/>
             </w:rPr>
           </w:pPr>
-          <w:hyperlink w:anchor="_Toc243371059" w:history="1">
+          <w:hyperlink w:anchor="_Toc243504110" w:history="1">
             <w:r>
               <w:rPr>
                 <w:rStyle w:val="Hipervnculo"/>
@@ -513,7 +513,7 @@
               <w:rPr>
                 <w:noProof/>
               </w:rPr>
-              <w:instrText xml:space="preserve"> PAGEREF _Toc243371059 \h </w:instrText>
+              <w:instrText xml:space="preserve"> PAGEREF _Toc243504110 \h </w:instrText>
             </w:r>
             <w:r>
               <w:rPr>
@@ -555,7 +555,7 @@
               <w14:ligatures w14:val="standardContextual"/>
             </w:rPr>
           </w:pPr>
-          <w:hyperlink w:anchor="_Toc243371060" w:history="1">
+          <w:hyperlink w:anchor="_Toc243504111" w:history="1">
             <w:r>
               <w:rPr>
                 <w:rStyle w:val="Hipervnculo"/>
@@ -579,7 +579,7 @@
               <w:rPr>
                 <w:noProof/>
               </w:rPr>
-              <w:instrText xml:space="preserve"> PAGEREF _Toc243371060 \h </w:instrText>
+              <w:instrText xml:space="preserve"> PAGEREF _Toc243504111 \h </w:instrText>
             </w:r>
             <w:r>
               <w:rPr>
@@ -621,7 +621,7 @@
               <w14:ligatures w14:val="standardContextual"/>
             </w:rPr>
           </w:pPr>
-          <w:hyperlink w:anchor="_Toc243371061" w:history="1">
+          <w:hyperlink w:anchor="_Toc243504112" w:history="1">
             <w:r>
               <w:rPr>
                 <w:rStyle w:val="Hipervnculo"/>
@@ -645,7 +645,7 @@
               <w:rPr>
                 <w:noProof/>
               </w:rPr>
-              <w:instrText xml:space="preserve"> PAGEREF _Toc243371061 \h </w:instrText>
+              <w:instrText xml:space="preserve"> PAGEREF _Toc243504112 \h </w:instrText>
             </w:r>
             <w:r>
               <w:rPr>
@@ -687,7 +687,7 @@
               <w14:ligatures w14:val="standardContextual"/>
             </w:rPr>
           </w:pPr>
-          <w:hyperlink w:anchor="_Toc243371062" w:history="1">
+          <w:hyperlink w:anchor="_Toc243504113" w:history="1">
             <w:r>
               <w:rPr>
                 <w:rStyle w:val="Hipervnculo"/>
@@ -711,7 +711,7 @@
               <w:rPr>
                 <w:noProof/>
               </w:rPr>
-              <w:instrText xml:space="preserve"> PAGEREF _Toc243371062 \h </w:instrText>
+              <w:instrText xml:space="preserve"> PAGEREF _Toc243504113 \h </w:instrText>
             </w:r>
             <w:r>
               <w:rPr>
@@ -753,7 +753,7 @@
               <w14:ligatures w14:val="standardContextual"/>
             </w:rPr>
           </w:pPr>
-          <w:hyperlink w:anchor="_Toc243371063" w:history="1">
+          <w:hyperlink w:anchor="_Toc243504114" w:history="1">
             <w:r>
               <w:rPr>
                 <w:rStyle w:val="Hipervnculo"/>
@@ -777,7 +777,7 @@
               <w:rPr>
                 <w:noProof/>
               </w:rPr>
-              <w:instrText xml:space="preserve"> PAGEREF _Toc243371063 \h </w:instrText>
+              <w:instrText xml:space="preserve"> PAGEREF _Toc243504114 \h </w:instrText>
             </w:r>
             <w:r>
               <w:rPr>
@@ -819,7 +819,7 @@
               <w14:ligatures w14:val="standardContextual"/>
             </w:rPr>
           </w:pPr>
-          <w:hyperlink w:anchor="_Toc243371064" w:history="1">
+          <w:hyperlink w:anchor="_Toc243504115" w:history="1">
             <w:r>
               <w:rPr>
                 <w:rStyle w:val="Hipervnculo"/>
@@ -843,7 +843,7 @@
               <w:rPr>
                 <w:noProof/>
               </w:rPr>
-              <w:instrText xml:space="preserve"> PAGEREF _Toc243371064 \h </w:instrText>
+              <w:instrText xml:space="preserve"> PAGEREF _Toc243504115 \h </w:instrText>
             </w:r>
             <w:r>
               <w:rPr>
@@ -885,7 +885,7 @@
               <w14:ligatures w14:val="standardContextual"/>
             </w:rPr>
           </w:pPr>
-          <w:hyperlink w:anchor="_Toc243371065" w:history="1">
+          <w:hyperlink w:anchor="_Toc243504116" w:history="1">
             <w:r>
               <w:rPr>
                 <w:rStyle w:val="Hipervnculo"/>
@@ -909,7 +909,7 @@
               <w:rPr>
                 <w:noProof/>
               </w:rPr>
-              <w:instrText xml:space="preserve"> PAGEREF _Toc243371065 \h </w:instrText>
+              <w:instrText xml:space="preserve"> PAGEREF _Toc243504116 \h </w:instrText>
             </w:r>
             <w:r>
               <w:rPr>
@@ -951,7 +951,7 @@
               <w14:ligatures w14:val="standardContextual"/>
             </w:rPr>
           </w:pPr>
-          <w:hyperlink w:anchor="_Toc243371066" w:history="1">
+          <w:hyperlink w:anchor="_Toc243504117" w:history="1">
             <w:r>
               <w:rPr>
                 <w:rStyle w:val="Hipervnculo"/>
@@ -975,7 +975,7 @@
               <w:rPr>
                 <w:noProof/>
               </w:rPr>
-              <w:instrText xml:space="preserve"> PAGEREF _Toc243371066 \h </w:instrText>
+              <w:instrText xml:space="preserve"> PAGEREF _Toc243504117 \h </w:instrText>
             </w:r>
             <w:r>
               <w:rPr>
@@ -1017,7 +1017,7 @@
               <w14:ligatures w14:val="standardContextual"/>
             </w:rPr>
           </w:pPr>
-          <w:hyperlink w:anchor="_Toc243371067" w:history="1">
+          <w:hyperlink w:anchor="_Toc243504118" w:history="1">
             <w:r>
               <w:rPr>
                 <w:rStyle w:val="Hipervnculo"/>
@@ -1041,7 +1041,7 @@
               <w:rPr>
                 <w:noProof/>
               </w:rPr>
-              <w:instrText xml:space="preserve"> PAGEREF _Toc243371067 \h </w:instrText>
+              <w:instrText xml:space="preserve"> PAGEREF _Toc243504118 \h </w:instrText>
             </w:r>
             <w:r>
               <w:rPr>
@@ -1083,7 +1083,7 @@
               <w14:ligatures w14:val="standardContextual"/>
             </w:rPr>
           </w:pPr>
-          <w:hyperlink w:anchor="_Toc243371068" w:history="1">
+          <w:hyperlink w:anchor="_Toc243504119" w:history="1">
             <w:r>
               <w:rPr>
                 <w:rStyle w:val="Hipervnculo"/>
@@ -1107,7 +1107,7 @@
               <w:rPr>
                 <w:noProof/>
               </w:rPr>
-              <w:instrText xml:space="preserve"> PAGEREF _Toc243371068 \h </w:instrText>
+              <w:instrText xml:space="preserve"> PAGEREF _Toc243504119 \h </w:instrText>
             </w:r>
             <w:r>
               <w:rPr>
@@ -1149,7 +1149,7 @@
               <w14:ligatures w14:val="standardContextual"/>
             </w:rPr>
           </w:pPr>
-          <w:hyperlink w:anchor="_Toc243371069" w:history="1">
+          <w:hyperlink w:anchor="_Toc243504120" w:history="1">
             <w:r>
               <w:rPr>
                 <w:rStyle w:val="Hipervnculo"/>
@@ -1173,7 +1173,7 @@
               <w:rPr>
                 <w:noProof/>
               </w:rPr>
-              <w:instrText xml:space="preserve"> PAGEREF _Toc243371069 \h </w:instrText>
+              <w:instrText xml:space="preserve"> PAGEREF _Toc243504120 \h </w:instrText>
             </w:r>
             <w:r>
               <w:rPr>
@@ -1215,7 +1215,7 @@
               <w14:ligatures w14:val="standardContextual"/>
             </w:rPr>
           </w:pPr>
-          <w:hyperlink w:anchor="_Toc243371070" w:history="1">
+          <w:hyperlink w:anchor="_Toc243504121" w:history="1">
             <w:r>
               <w:rPr>
                 <w:rStyle w:val="Hipervnculo"/>
@@ -1239,7 +1239,7 @@
               <w:rPr>
                 <w:noProof/>
               </w:rPr>
-              <w:instrText xml:space="preserve"> PAGEREF _Toc243371070 \h </w:instrText>
+              <w:instrText xml:space="preserve"> PAGEREF _Toc243504121 \h </w:instrText>
             </w:r>
             <w:r>
               <w:rPr>
@@ -1281,7 +1281,7 @@
               <w14:ligatures w14:val="standardContextual"/>
             </w:rPr>
           </w:pPr>
-          <w:hyperlink w:anchor="_Toc243371071" w:history="1">
+          <w:hyperlink w:anchor="_Toc243504122" w:history="1">
             <w:r>
               <w:rPr>
                 <w:rStyle w:val="Hipervnculo"/>
@@ -1305,7 +1305,7 @@
               <w:rPr>
                 <w:noProof/>
               </w:rPr>
-              <w:instrText xml:space="preserve"> PAGEREF _Toc243371071 \h </w:instrText>
+              <w:instrText xml:space="preserve"> PAGEREF _Toc243504122 \h </w:instrText>
             </w:r>
             <w:r>
               <w:rPr>
@@ -1347,7 +1347,7 @@
               <w14:ligatures w14:val="standardContextual"/>
             </w:rPr>
           </w:pPr>
-          <w:hyperlink w:anchor="_Toc243371072" w:history="1">
+          <w:hyperlink w:anchor="_Toc243504123" w:history="1">
             <w:r>
               <w:rPr>
                 <w:rStyle w:val="Hipervnculo"/>
@@ -1371,7 +1371,7 @@
               <w:rPr>
                 <w:noProof/>
               </w:rPr>
-              <w:instrText xml:space="preserve"> PAGEREF _Toc243371072 \h </w:instrText>
+              <w:instrText xml:space="preserve"> PAGEREF _Toc243504123 \h </w:instrText>
             </w:r>
             <w:r>
               <w:rPr>
@@ -1413,7 +1413,7 @@
               <w14:ligatures w14:val="standardContextual"/>
             </w:rPr>
           </w:pPr>
-          <w:hyperlink w:anchor="_Toc243371073" w:history="1">
+          <w:hyperlink w:anchor="_Toc243504124" w:history="1">
             <w:r>
               <w:rPr>
                 <w:rStyle w:val="Hipervnculo"/>
@@ -1437,7 +1437,7 @@
               <w:rPr>
                 <w:noProof/>
               </w:rPr>
-              <w:instrText xml:space="preserve"> PAGEREF _Toc243371073 \h </w:instrText>
+              <w:instrText xml:space="preserve"> PAGEREF _Toc243504124 \h </w:instrText>
             </w:r>
             <w:r>
               <w:rPr>
@@ -1479,7 +1479,7 @@
               <w14:ligatures w14:val="standardContextual"/>
             </w:rPr>
           </w:pPr>
-          <w:hyperlink w:anchor="_Toc243371074" w:history="1">
+          <w:hyperlink w:anchor="_Toc243504125" w:history="1">
             <w:r>
               <w:rPr>
                 <w:rStyle w:val="Hipervnculo"/>
@@ -1503,7 +1503,7 @@
               <w:rPr>
                 <w:noProof/>
               </w:rPr>
-              <w:instrText xml:space="preserve"> PAGEREF _Toc243371074 \h </w:instrText>
+              <w:instrText xml:space="preserve"> PAGEREF _Toc243504125 \h </w:instrText>
             </w:r>
             <w:r>
               <w:rPr>
@@ -1545,7 +1545,7 @@
               <w14:ligatures w14:val="standardContextual"/>
             </w:rPr>
           </w:pPr>
-          <w:hyperlink w:anchor="_Toc243371075" w:history="1">
+          <w:hyperlink w:anchor="_Toc243504126" w:history="1">
             <w:r>
               <w:rPr>
                 <w:rStyle w:val="Hipervnculo"/>
@@ -1569,7 +1569,7 @@
               <w:rPr>
                 <w:noProof/>
               </w:rPr>
-              <w:instrText xml:space="preserve"> PAGEREF _Toc243371075 \h </w:instrText>
+              <w:instrText xml:space="preserve"> PAGEREF _Toc243504126 \h </w:instrText>
             </w:r>
             <w:r>
               <w:rPr>
@@ -1611,7 +1611,7 @@
               <w14:ligatures w14:val="standardContextual"/>
             </w:rPr>
           </w:pPr>
-          <w:hyperlink w:anchor="_Toc243371076" w:history="1">
+          <w:hyperlink w:anchor="_Toc243504127" w:history="1">
             <w:r>
               <w:rPr>
                 <w:rStyle w:val="Hipervnculo"/>
@@ -1635,7 +1635,7 @@
               <w:rPr>
                 <w:noProof/>
               </w:rPr>
-              <w:instrText xml:space="preserve"> PAGEREF _Toc243371076 \h </w:instrText>
+              <w:instrText xml:space="preserve"> PAGEREF _Toc243504127 \h </w:instrText>
             </w:r>
             <w:r>
               <w:rPr>
@@ -1652,7 +1652,7 @@
               <w:rPr>
                 <w:noProof/>
               </w:rPr>
-              <w:t>15</w:t>
+              <w:t>16</w:t>
             </w:r>
             <w:r>
               <w:rPr>
@@ -1677,7 +1677,7 @@
               <w14:ligatures w14:val="standardContextual"/>
             </w:rPr>
           </w:pPr>
-          <w:hyperlink w:anchor="_Toc243371077" w:history="1">
+          <w:hyperlink w:anchor="_Toc243504128" w:history="1">
             <w:r>
               <w:rPr>
                 <w:rStyle w:val="Hipervnculo"/>
@@ -1701,7 +1701,7 @@
               <w:rPr>
                 <w:noProof/>
               </w:rPr>
-              <w:instrText xml:space="preserve"> PAGEREF _Toc243371077 \h </w:instrText>
+              <w:instrText xml:space="preserve"> PAGEREF _Toc243504128 \h </w:instrText>
             </w:r>
             <w:r>
               <w:rPr>
@@ -1743,7 +1743,7 @@
               <w14:ligatures w14:val="standardContextual"/>
             </w:rPr>
           </w:pPr>
-          <w:hyperlink w:anchor="_Toc243371078" w:history="1">
+          <w:hyperlink w:anchor="_Toc243504129" w:history="1">
             <w:r>
               <w:rPr>
                 <w:rStyle w:val="Hipervnculo"/>
@@ -1767,7 +1767,7 @@
               <w:rPr>
                 <w:noProof/>
               </w:rPr>
-              <w:instrText xml:space="preserve"> PAGEREF _Toc243371078 \h </w:instrText>
+              <w:instrText xml:space="preserve"> PAGEREF _Toc243504129 \h </w:instrText>
             </w:r>
             <w:r>
               <w:rPr>
@@ -1784,7 +1784,7 @@
               <w:rPr>
                 <w:noProof/>
               </w:rPr>
-              <w:t>16</w:t>
+              <w:t>17</w:t>
             </w:r>
             <w:r>
               <w:rPr>
@@ -1809,7 +1809,7 @@
               <w14:ligatures w14:val="standardContextual"/>
             </w:rPr>
           </w:pPr>
-          <w:hyperlink w:anchor="_Toc243371079" w:history="1">
+          <w:hyperlink w:anchor="_Toc243504130" w:history="1">
             <w:r>
               <w:rPr>
                 <w:rStyle w:val="Hipervnculo"/>
@@ -1833,7 +1833,7 @@
               <w:rPr>
                 <w:noProof/>
               </w:rPr>
-              <w:instrText xml:space="preserve"> PAGEREF _Toc243371079 \h </w:instrText>
+              <w:instrText xml:space="preserve"> PAGEREF _Toc243504130 \h </w:instrText>
             </w:r>
             <w:r>
               <w:rPr>
@@ -1875,7 +1875,7 @@
               <w14:ligatures w14:val="standardContextual"/>
             </w:rPr>
           </w:pPr>
-          <w:hyperlink w:anchor="_Toc243371080" w:history="1">
+          <w:hyperlink w:anchor="_Toc243504131" w:history="1">
             <w:r>
               <w:rPr>
                 <w:rStyle w:val="Hipervnculo"/>
@@ -1899,7 +1899,7 @@
               <w:rPr>
                 <w:noProof/>
               </w:rPr>
-              <w:instrText xml:space="preserve"> PAGEREF _Toc243371080 \h </w:instrText>
+              <w:instrText xml:space="preserve"> PAGEREF _Toc243504131 \h </w:instrText>
             </w:r>
             <w:r>
               <w:rPr>
@@ -1941,7 +1941,7 @@
               <w14:ligatures w14:val="standardContextual"/>
             </w:rPr>
           </w:pPr>
-          <w:hyperlink w:anchor="_Toc243371081" w:history="1">
+          <w:hyperlink w:anchor="_Toc243504132" w:history="1">
             <w:r>
               <w:rPr>
                 <w:rStyle w:val="Hipervnculo"/>
@@ -1965,7 +1965,7 @@
               <w:rPr>
                 <w:noProof/>
               </w:rPr>
-              <w:instrText xml:space="preserve"> PAGEREF _Toc243371081 \h </w:instrText>
+              <w:instrText xml:space="preserve"> PAGEREF _Toc243504132 \h </w:instrText>
             </w:r>
             <w:r>
               <w:rPr>
@@ -2007,7 +2007,7 @@
               <w14:ligatures w14:val="standardContextual"/>
             </w:rPr>
           </w:pPr>
-          <w:hyperlink w:anchor="_Toc243371082" w:history="1">
+          <w:hyperlink w:anchor="_Toc243504133" w:history="1">
             <w:r>
               <w:rPr>
                 <w:rStyle w:val="Hipervnculo"/>
@@ -2031,7 +2031,7 @@
               <w:rPr>
                 <w:noProof/>
               </w:rPr>
-              <w:instrText xml:space="preserve"> PAGEREF _Toc243371082 \h </w:instrText>
+              <w:instrText xml:space="preserve"> PAGEREF _Toc243504133 \h </w:instrText>
             </w:r>
             <w:r>
               <w:rPr>
@@ -2073,7 +2073,7 @@
               <w14:ligatures w14:val="standardContextual"/>
             </w:rPr>
           </w:pPr>
-          <w:hyperlink w:anchor="_Toc243371083" w:history="1">
+          <w:hyperlink w:anchor="_Toc243504134" w:history="1">
             <w:r>
               <w:rPr>
                 <w:rStyle w:val="Hipervnculo"/>
@@ -2097,7 +2097,7 @@
               <w:rPr>
                 <w:noProof/>
               </w:rPr>
-              <w:instrText xml:space="preserve"> PAGEREF _Toc243371083 \h </w:instrText>
+              <w:instrText xml:space="preserve"> PAGEREF _Toc243504134 \h </w:instrText>
             </w:r>
             <w:r>
               <w:rPr>
@@ -2139,13 +2139,13 @@
               <w14:ligatures w14:val="standardContextual"/>
             </w:rPr>
           </w:pPr>
-          <w:hyperlink w:anchor="_Toc243371084" w:history="1">
+          <w:hyperlink w:anchor="_Toc243504135" w:history="1">
             <w:r>
               <w:rPr>
                 <w:rStyle w:val="Hipervnculo"/>
                 <w:noProof/>
               </w:rPr>
-              <w:t>7.4 Pruebas de la capa de acceso a datos</w:t>
+              <w:t>7.4 Interfaz web de la aplicación</w:t>
             </w:r>
             <w:r>
               <w:rPr>
@@ -2163,7 +2163,7 @@
               <w:rPr>
                 <w:noProof/>
               </w:rPr>
-              <w:instrText xml:space="preserve"> PAGEREF _Toc243371084 \h </w:instrText>
+              <w:instrText xml:space="preserve"> PAGEREF _Toc243504135 \h </w:instrText>
             </w:r>
             <w:r>
               <w:rPr>
@@ -2205,13 +2205,13 @@
               <w14:ligatures w14:val="standardContextual"/>
             </w:rPr>
           </w:pPr>
-          <w:hyperlink w:anchor="_Toc243371085" w:history="1">
+          <w:hyperlink w:anchor="_Toc243504136" w:history="1">
             <w:r>
               <w:rPr>
                 <w:rStyle w:val="Hipervnculo"/>
                 <w:noProof/>
               </w:rPr>
-              <w:t>7.5 Video demo reel (3 a 5 minutos)</w:t>
+              <w:t>7.5 Pruebas de la capa de acceso a datos</w:t>
             </w:r>
             <w:r>
               <w:rPr>
@@ -2229,7 +2229,7 @@
               <w:rPr>
                 <w:noProof/>
               </w:rPr>
-              <w:instrText xml:space="preserve"> PAGEREF _Toc243371085 \h </w:instrText>
+              <w:instrText xml:space="preserve"> PAGEREF _Toc243504136 \h </w:instrText>
             </w:r>
             <w:r>
               <w:rPr>
@@ -2246,7 +2246,7 @@
               <w:rPr>
                 <w:noProof/>
               </w:rPr>
-              <w:t>29</w:t>
+              <w:t>32</w:t>
             </w:r>
             <w:r>
               <w:rPr>
@@ -2271,13 +2271,13 @@
               <w14:ligatures w14:val="standardContextual"/>
             </w:rPr>
           </w:pPr>
-          <w:hyperlink w:anchor="_Toc243371086" w:history="1">
+          <w:hyperlink w:anchor="_Toc243504137" w:history="1">
             <w:r>
               <w:rPr>
                 <w:rStyle w:val="Hipervnculo"/>
                 <w:noProof/>
               </w:rPr>
-              <w:t>7.6 Cronograma</w:t>
+              <w:t>7.6 Video demo reel (3 a 5 minutos)</w:t>
             </w:r>
             <w:r>
               <w:rPr>
@@ -2295,7 +2295,7 @@
               <w:rPr>
                 <w:noProof/>
               </w:rPr>
-              <w:instrText xml:space="preserve"> PAGEREF _Toc243371086 \h </w:instrText>
+              <w:instrText xml:space="preserve"> PAGEREF _Toc243504137 \h </w:instrText>
             </w:r>
             <w:r>
               <w:rPr>
@@ -2312,7 +2312,73 @@
               <w:rPr>
                 <w:noProof/>
               </w:rPr>
-              <w:t>29</w:t>
+              <w:t>33</w:t>
+            </w:r>
+            <w:r>
+              <w:rPr>
+                <w:noProof/>
+              </w:rPr>
+              <w:fldChar w:fldCharType="end"/>
+            </w:r>
+          </w:hyperlink>
+        </w:p>
+        <w:p>
+          <w:pPr>
+            <w:pStyle w:val="TDC2"/>
+            <w:tabs>
+              <w:tab w:val="right" w:leader="dot" w:pos="9062"/>
+            </w:tabs>
+            <w:rPr>
+              <w:rFonts w:asciiTheme="minorHAnsi" w:eastAsiaTheme="minorEastAsia" w:hAnsiTheme="minorHAnsi" w:cstheme="minorBidi"/>
+              <w:noProof/>
+              <w:kern w:val="2"/>
+              <w:sz w:val="24"/>
+              <w:szCs w:val="24"/>
+              <w14:ligatures w14:val="standardContextual"/>
+            </w:rPr>
+          </w:pPr>
+          <w:hyperlink w:anchor="_Toc243504138" w:history="1">
+            <w:r>
+              <w:rPr>
+                <w:rStyle w:val="Hipervnculo"/>
+                <w:noProof/>
+              </w:rPr>
+              <w:t>7.7 Cronograma</w:t>
+            </w:r>
+            <w:r>
+              <w:rPr>
+                <w:noProof/>
+              </w:rPr>
+              <w:tab/>
+            </w:r>
+            <w:r>
+              <w:rPr>
+                <w:noProof/>
+              </w:rPr>
+              <w:fldChar w:fldCharType="begin"/>
+            </w:r>
+            <w:r>
+              <w:rPr>
+                <w:noProof/>
+              </w:rPr>
+              <w:instrText xml:space="preserve"> PAGEREF _Toc243504138 \h </w:instrText>
+            </w:r>
+            <w:r>
+              <w:rPr>
+                <w:noProof/>
+              </w:rPr>
+            </w:r>
+            <w:r>
+              <w:rPr>
+                <w:noProof/>
+              </w:rPr>
+              <w:fldChar w:fldCharType="separate"/>
+            </w:r>
+            <w:r>
+              <w:rPr>
+                <w:noProof/>
+              </w:rPr>
+              <w:t>33</w:t>
             </w:r>
             <w:r>
               <w:rPr>
@@ -2337,7 +2403,7 @@
               <w14:ligatures w14:val="standardContextual"/>
             </w:rPr>
           </w:pPr>
-          <w:hyperlink w:anchor="_Toc243371087" w:history="1">
+          <w:hyperlink w:anchor="_Toc243504139" w:history="1">
             <w:r>
               <w:rPr>
                 <w:rStyle w:val="Hipervnculo"/>
@@ -2361,7 +2427,7 @@
               <w:rPr>
                 <w:noProof/>
               </w:rPr>
-              <w:instrText xml:space="preserve"> PAGEREF _Toc243371087 \h </w:instrText>
+              <w:instrText xml:space="preserve"> PAGEREF _Toc243504139 \h </w:instrText>
             </w:r>
             <w:r>
               <w:rPr>
@@ -2378,7 +2444,7 @@
               <w:rPr>
                 <w:noProof/>
               </w:rPr>
-              <w:t>31</w:t>
+              <w:t>34</w:t>
             </w:r>
             <w:r>
               <w:rPr>
@@ -2403,7 +2469,7 @@
               <w14:ligatures w14:val="standardContextual"/>
             </w:rPr>
           </w:pPr>
-          <w:hyperlink w:anchor="_Toc243371088" w:history="1">
+          <w:hyperlink w:anchor="_Toc243504140" w:history="1">
             <w:r>
               <w:rPr>
                 <w:rStyle w:val="Hipervnculo"/>
@@ -2427,7 +2493,7 @@
               <w:rPr>
                 <w:noProof/>
               </w:rPr>
-              <w:instrText xml:space="preserve"> PAGEREF _Toc243371088 \h </w:instrText>
+              <w:instrText xml:space="preserve"> PAGEREF _Toc243504140 \h </w:instrText>
             </w:r>
             <w:r>
               <w:rPr>
@@ -2444,7 +2510,7 @@
               <w:rPr>
                 <w:noProof/>
               </w:rPr>
-              <w:t>31</w:t>
+              <w:t>34</w:t>
             </w:r>
             <w:r>
               <w:rPr>
@@ -2469,7 +2535,7 @@
               <w14:ligatures w14:val="standardContextual"/>
             </w:rPr>
           </w:pPr>
-          <w:hyperlink w:anchor="_Toc243371089" w:history="1">
+          <w:hyperlink w:anchor="_Toc243504141" w:history="1">
             <w:r>
               <w:rPr>
                 <w:rStyle w:val="Hipervnculo"/>
@@ -2493,7 +2559,7 @@
               <w:rPr>
                 <w:noProof/>
               </w:rPr>
-              <w:instrText xml:space="preserve"> PAGEREF _Toc243371089 \h </w:instrText>
+              <w:instrText xml:space="preserve"> PAGEREF _Toc243504141 \h </w:instrText>
             </w:r>
             <w:r>
               <w:rPr>
@@ -2510,7 +2576,7 @@
               <w:rPr>
                 <w:noProof/>
               </w:rPr>
-              <w:t>32</w:t>
+              <w:t>35</w:t>
             </w:r>
             <w:r>
               <w:rPr>
@@ -2535,7 +2601,7 @@
               <w14:ligatures w14:val="standardContextual"/>
             </w:rPr>
           </w:pPr>
-          <w:hyperlink w:anchor="_Toc243371090" w:history="1">
+          <w:hyperlink w:anchor="_Toc243504142" w:history="1">
             <w:r>
               <w:rPr>
                 <w:rStyle w:val="Hipervnculo"/>
@@ -2559,7 +2625,7 @@
               <w:rPr>
                 <w:noProof/>
               </w:rPr>
-              <w:instrText xml:space="preserve"> PAGEREF _Toc243371090 \h </w:instrText>
+              <w:instrText xml:space="preserve"> PAGEREF _Toc243504142 \h </w:instrText>
             </w:r>
             <w:r>
               <w:rPr>
@@ -2576,7 +2642,7 @@
               <w:rPr>
                 <w:noProof/>
               </w:rPr>
-              <w:t>33</w:t>
+              <w:t>36</w:t>
             </w:r>
             <w:r>
               <w:rPr>
@@ -2601,7 +2667,7 @@
               <w14:ligatures w14:val="standardContextual"/>
             </w:rPr>
           </w:pPr>
-          <w:hyperlink w:anchor="_Toc243371091" w:history="1">
+          <w:hyperlink w:anchor="_Toc243504143" w:history="1">
             <w:r>
               <w:rPr>
                 <w:rStyle w:val="Hipervnculo"/>
@@ -2625,7 +2691,7 @@
               <w:rPr>
                 <w:noProof/>
               </w:rPr>
-              <w:instrText xml:space="preserve"> PAGEREF _Toc243371091 \h </w:instrText>
+              <w:instrText xml:space="preserve"> PAGEREF _Toc243504143 \h </w:instrText>
             </w:r>
             <w:r>
               <w:rPr>
@@ -2642,7 +2708,7 @@
               <w:rPr>
                 <w:noProof/>
               </w:rPr>
-              <w:t>34</w:t>
+              <w:t>37</w:t>
             </w:r>
             <w:r>
               <w:rPr>
@@ -2667,7 +2733,7 @@
               <w14:ligatures w14:val="standardContextual"/>
             </w:rPr>
           </w:pPr>
-          <w:hyperlink w:anchor="_Toc243371092" w:history="1">
+          <w:hyperlink w:anchor="_Toc243504144" w:history="1">
             <w:r>
               <w:rPr>
                 <w:rStyle w:val="Hipervnculo"/>
@@ -2691,7 +2757,7 @@
               <w:rPr>
                 <w:noProof/>
               </w:rPr>
-              <w:instrText xml:space="preserve"> PAGEREF _Toc243371092 \h </w:instrText>
+              <w:instrText xml:space="preserve"> PAGEREF _Toc243504144 \h </w:instrText>
             </w:r>
             <w:r>
               <w:rPr>
@@ -2708,7 +2774,7 @@
               <w:rPr>
                 <w:noProof/>
               </w:rPr>
-              <w:t>34</w:t>
+              <w:t>37</w:t>
             </w:r>
             <w:r>
               <w:rPr>
@@ -2733,7 +2799,7 @@
               <w14:ligatures w14:val="standardContextual"/>
             </w:rPr>
           </w:pPr>
-          <w:hyperlink w:anchor="_Toc243371093" w:history="1">
+          <w:hyperlink w:anchor="_Toc243504145" w:history="1">
             <w:r>
               <w:rPr>
                 <w:rStyle w:val="Hipervnculo"/>
@@ -2757,7 +2823,7 @@
               <w:rPr>
                 <w:noProof/>
               </w:rPr>
-              <w:instrText xml:space="preserve"> PAGEREF _Toc243371093 \h </w:instrText>
+              <w:instrText xml:space="preserve"> PAGEREF _Toc243504145 \h </w:instrText>
             </w:r>
             <w:r>
               <w:rPr>
@@ -2774,7 +2840,7 @@
               <w:rPr>
                 <w:noProof/>
               </w:rPr>
-              <w:t>34</w:t>
+              <w:t>37</w:t>
             </w:r>
             <w:r>
               <w:rPr>
@@ -2799,7 +2865,7 @@
               <w14:ligatures w14:val="standardContextual"/>
             </w:rPr>
           </w:pPr>
-          <w:hyperlink w:anchor="_Toc243371094" w:history="1">
+          <w:hyperlink w:anchor="_Toc243504146" w:history="1">
             <w:r>
               <w:rPr>
                 <w:rStyle w:val="Hipervnculo"/>
@@ -2823,7 +2889,7 @@
               <w:rPr>
                 <w:noProof/>
               </w:rPr>
-              <w:instrText xml:space="preserve"> PAGEREF _Toc243371094 \h </w:instrText>
+              <w:instrText xml:space="preserve"> PAGEREF _Toc243504146 \h </w:instrText>
             </w:r>
             <w:r>
               <w:rPr>
@@ -2840,7 +2906,7 @@
               <w:rPr>
                 <w:noProof/>
               </w:rPr>
-              <w:t>35</w:t>
+              <w:t>38</w:t>
             </w:r>
             <w:r>
               <w:rPr>
@@ -2865,7 +2931,7 @@
               <w14:ligatures w14:val="standardContextual"/>
             </w:rPr>
           </w:pPr>
-          <w:hyperlink w:anchor="_Toc243371095" w:history="1">
+          <w:hyperlink w:anchor="_Toc243504147" w:history="1">
             <w:r>
               <w:rPr>
                 <w:rStyle w:val="Hipervnculo"/>
@@ -2889,7 +2955,7 @@
               <w:rPr>
                 <w:noProof/>
               </w:rPr>
-              <w:instrText xml:space="preserve"> PAGEREF _Toc243371095 \h </w:instrText>
+              <w:instrText xml:space="preserve"> PAGEREF _Toc243504147 \h </w:instrText>
             </w:r>
             <w:r>
               <w:rPr>
@@ -2906,7 +2972,7 @@
               <w:rPr>
                 <w:noProof/>
               </w:rPr>
-              <w:t>35</w:t>
+              <w:t>38</w:t>
             </w:r>
             <w:r>
               <w:rPr>
@@ -2944,7 +3010,7 @@
         <w:pStyle w:val="Ttulo1"/>
         <w:pageBreakBefore/>
       </w:pPr>
-      <w:bookmarkStart w:id="0" w:name="_Toc243371057"/>
+      <w:bookmarkStart w:id="0" w:name="_Toc243504108"/>
       <w:r>
         <w:lastRenderedPageBreak/>
         <w:t>1. RESUMEN</w:t>
@@ -2981,7 +3047,7 @@
         <w:jc w:val="both"/>
       </w:pPr>
       <w:r>
-        <w:t>Como elementos desarrollados se entregan el código fuente en GitHub, el script de base de datos PostgreSQL, la documentación interactiva OpenAPI/Swagger, la colección Postman, los archivos de despliegue (Procfile, system.properties, app.json, Dockerfile y render.yaml), las evidencias de ejecución y el presente informe.</w:t>
+        <w:t>Además se desarrolló una interfaz web que consume la API desde la misma URL: inicio de sesión, panel con indicadores de la flota y pantallas de gestión para cada recurso, con opciones según el rol del usuario.</w:t>
       </w:r>
     </w:p>
     <w:p>
@@ -2990,6 +3056,15 @@
         <w:jc w:val="both"/>
       </w:pPr>
       <w:r>
+        <w:t>Como elementos desarrollados se entregan el código fuente en GitHub, la aplicación publicada en Render (API e interfaz web), el script de base de datos PostgreSQL, la documentación interactiva OpenAPI/Swagger, las colecciones Postman, los archivos de despliegue (Procfile, system.properties, app.json, Dockerfile y render.yaml), las evidencias de ejecución y el presente informe.</w:t>
+      </w:r>
+    </w:p>
+    <w:p>
+      <w:pPr>
+        <w:spacing w:after="120"/>
+        <w:jc w:val="both"/>
+      </w:pPr>
+      <w:r>
         <w:rPr>
           <w:b/>
           <w:bCs/>
@@ -3009,9 +3084,8 @@
         <w:pStyle w:val="Ttulo1"/>
         <w:pageBreakBefore/>
       </w:pPr>
-      <w:bookmarkStart w:id="1" w:name="_Toc243371058"/>
-      <w:r>
-        <w:lastRenderedPageBreak/>
+      <w:bookmarkStart w:id="1" w:name="_Toc243504109"/>
+      <w:r>
         <w:t>2. INTRODUCCIÓN</w:t>
       </w:r>
       <w:bookmarkEnd w:id="1"/>
@@ -3069,9 +3143,8 @@
         <w:pStyle w:val="Ttulo1"/>
         <w:pageBreakBefore/>
       </w:pPr>
-      <w:bookmarkStart w:id="2" w:name="_Toc243371059"/>
-      <w:r>
-        <w:lastRenderedPageBreak/>
+      <w:bookmarkStart w:id="2" w:name="_Toc243504110"/>
+      <w:r>
         <w:t>3. DIAGNÓSTICO</w:t>
       </w:r>
       <w:bookmarkEnd w:id="2"/>
@@ -3080,7 +3153,7 @@
       <w:pPr>
         <w:pStyle w:val="Ttulo2"/>
       </w:pPr>
-      <w:bookmarkStart w:id="3" w:name="_Toc243371060"/>
+      <w:bookmarkStart w:id="3" w:name="_Toc243504111"/>
       <w:r>
         <w:t>3.1 Situación problemática</w:t>
       </w:r>
@@ -3183,9 +3256,8 @@
       <w:pPr>
         <w:pStyle w:val="Ttulo2"/>
       </w:pPr>
-      <w:bookmarkStart w:id="4" w:name="_Toc243371061"/>
-      <w:r>
-        <w:lastRenderedPageBreak/>
+      <w:bookmarkStart w:id="4" w:name="_Toc243504112"/>
+      <w:r>
         <w:t>3.2 Diagrama de causas</w:t>
       </w:r>
       <w:bookmarkEnd w:id="4"/>
@@ -3201,10 +3273,10 @@
           <w:noProof/>
         </w:rPr>
         <w:drawing>
-          <wp:inline distT="0" distB="0" distL="0" distR="0" wp14:anchorId="1B894E31" wp14:editId="7D896206">
+          <wp:inline distT="0" distB="0" distL="0" distR="0" wp14:anchorId="2F2AB14C" wp14:editId="13E08A9A">
             <wp:extent cx="5334000" cy="2219325"/>
             <wp:effectExtent l="0" t="0" r="0" b="0"/>
-            <wp:docPr id="277959132" name="Imagen 277959132"/>
+            <wp:docPr id="1825882257" name="Imagen 1825882257"/>
             <wp:cNvGraphicFramePr>
               <a:graphicFrameLocks xmlns:a="http://schemas.openxmlformats.org/drawingml/2006/main" noChangeAspect="1"/>
             </wp:cNvGraphicFramePr>
@@ -3275,10 +3347,10 @@
           <w:noProof/>
         </w:rPr>
         <w:drawing>
-          <wp:inline distT="0" distB="0" distL="0" distR="0" wp14:anchorId="1A82712D" wp14:editId="193C7B87">
+          <wp:inline distT="0" distB="0" distL="0" distR="0" wp14:anchorId="2831EF31" wp14:editId="1EB1FBF3">
             <wp:extent cx="5334000" cy="2209800"/>
             <wp:effectExtent l="0" t="0" r="0" b="0"/>
-            <wp:docPr id="247294161" name="Imagen 247294161"/>
+            <wp:docPr id="824903200" name="Imagen 824903200"/>
             <wp:cNvGraphicFramePr>
               <a:graphicFrameLocks xmlns:a="http://schemas.openxmlformats.org/drawingml/2006/main" noChangeAspect="1"/>
             </wp:cNvGraphicFramePr>
@@ -3349,10 +3421,10 @@
           <w:noProof/>
         </w:rPr>
         <w:drawing>
-          <wp:inline distT="0" distB="0" distL="0" distR="0" wp14:anchorId="405BBC04" wp14:editId="1A48B45B">
+          <wp:inline distT="0" distB="0" distL="0" distR="0" wp14:anchorId="2D1B6841" wp14:editId="0F7B4A53">
             <wp:extent cx="5334000" cy="2238375"/>
             <wp:effectExtent l="0" t="0" r="0" b="0"/>
-            <wp:docPr id="143407565" name="Imagen 143407565"/>
+            <wp:docPr id="1773590703" name="Imagen 1773590703"/>
             <wp:cNvGraphicFramePr>
               <a:graphicFrameLocks xmlns:a="http://schemas.openxmlformats.org/drawingml/2006/main" noChangeAspect="1"/>
             </wp:cNvGraphicFramePr>
@@ -3416,7 +3488,7 @@
       <w:pPr>
         <w:pStyle w:val="Ttulo2"/>
       </w:pPr>
-      <w:bookmarkStart w:id="5" w:name="_Toc243371062"/>
+      <w:bookmarkStart w:id="5" w:name="_Toc243504113"/>
       <w:r>
         <w:t>3.3 Análisis SEPTE</w:t>
       </w:r>
@@ -4437,10 +4509,10 @@
           <w:noProof/>
         </w:rPr>
         <w:drawing>
-          <wp:inline distT="0" distB="0" distL="0" distR="0" wp14:anchorId="723BC4CC" wp14:editId="79F9B9B8">
+          <wp:inline distT="0" distB="0" distL="0" distR="0" wp14:anchorId="07DF1B49" wp14:editId="15267DCA">
             <wp:extent cx="5715000" cy="2981325"/>
             <wp:effectExtent l="0" t="0" r="0" b="0"/>
-            <wp:docPr id="1701128698" name="Imagen 1701128698"/>
+            <wp:docPr id="1158340654" name="Imagen 1158340654"/>
             <wp:cNvGraphicFramePr>
               <a:graphicFrameLocks xmlns:a="http://schemas.openxmlformats.org/drawingml/2006/main" noChangeAspect="1"/>
             </wp:cNvGraphicFramePr>
@@ -4511,10 +4583,10 @@
           <w:noProof/>
         </w:rPr>
         <w:drawing>
-          <wp:inline distT="0" distB="0" distL="0" distR="0" wp14:anchorId="7C56D288" wp14:editId="29D7B401">
+          <wp:inline distT="0" distB="0" distL="0" distR="0" wp14:anchorId="00B45FB1" wp14:editId="22C7AA59">
             <wp:extent cx="4953000" cy="2238375"/>
             <wp:effectExtent l="0" t="0" r="0" b="0"/>
-            <wp:docPr id="914834529" name="Imagen 914834529"/>
+            <wp:docPr id="2052274884" name="Imagen 2052274884"/>
             <wp:cNvGraphicFramePr>
               <a:graphicFrameLocks xmlns:a="http://schemas.openxmlformats.org/drawingml/2006/main" noChangeAspect="1"/>
             </wp:cNvGraphicFramePr>
@@ -4585,10 +4657,10 @@
           <w:noProof/>
         </w:rPr>
         <w:drawing>
-          <wp:inline distT="0" distB="0" distL="0" distR="0" wp14:anchorId="532142EF" wp14:editId="3E11A9FC">
+          <wp:inline distT="0" distB="0" distL="0" distR="0" wp14:anchorId="60DECFC7" wp14:editId="5ED5FA84">
             <wp:extent cx="4953000" cy="2667000"/>
             <wp:effectExtent l="0" t="0" r="0" b="0"/>
-            <wp:docPr id="1536983336" name="Imagen 1536983336"/>
+            <wp:docPr id="316408948" name="Imagen 316408948"/>
             <wp:cNvGraphicFramePr>
               <a:graphicFrameLocks xmlns:a="http://schemas.openxmlformats.org/drawingml/2006/main" noChangeAspect="1"/>
             </wp:cNvGraphicFramePr>
@@ -4652,7 +4724,7 @@
       <w:pPr>
         <w:pStyle w:val="Ttulo2"/>
       </w:pPr>
-      <w:bookmarkStart w:id="6" w:name="_Toc243371063"/>
+      <w:bookmarkStart w:id="6" w:name="_Toc243504114"/>
       <w:r>
         <w:t>3.4 Oportunidad de mejora</w:t>
       </w:r>
@@ -4675,7 +4747,7 @@
         <w:pStyle w:val="Ttulo1"/>
         <w:pageBreakBefore/>
       </w:pPr>
-      <w:bookmarkStart w:id="7" w:name="_Toc243371064"/>
+      <w:bookmarkStart w:id="7" w:name="_Toc243504115"/>
       <w:r>
         <w:t>4. OBJETIVOS</w:t>
       </w:r>
@@ -4685,7 +4757,7 @@
       <w:pPr>
         <w:pStyle w:val="Ttulo2"/>
       </w:pPr>
-      <w:bookmarkStart w:id="8" w:name="_Toc243371065"/>
+      <w:bookmarkStart w:id="8" w:name="_Toc243504116"/>
       <w:r>
         <w:t>4.1 Objetivo general</w:t>
       </w:r>
@@ -4704,7 +4776,7 @@
       <w:pPr>
         <w:pStyle w:val="Ttulo2"/>
       </w:pPr>
-      <w:bookmarkStart w:id="9" w:name="_Toc243371066"/>
+      <w:bookmarkStart w:id="9" w:name="_Toc243504117"/>
       <w:r>
         <w:t>4.2 Objetivos específicos (SMART)</w:t>
       </w:r>
@@ -5654,7 +5726,7 @@
         <w:pStyle w:val="Ttulo1"/>
         <w:pageBreakBefore/>
       </w:pPr>
-      <w:bookmarkStart w:id="10" w:name="_Toc243371067"/>
+      <w:bookmarkStart w:id="10" w:name="_Toc243504118"/>
       <w:r>
         <w:t>5. JUSTIFICACIÓN DEL PROYECTO</w:t>
       </w:r>
@@ -5745,7 +5817,7 @@
       <w:pPr>
         <w:pStyle w:val="Ttulo2"/>
       </w:pPr>
-      <w:bookmarkStart w:id="11" w:name="_Toc243371068"/>
+      <w:bookmarkStart w:id="11" w:name="_Toc243504119"/>
       <w:r>
         <w:t>5.1 Beneficiarios</w:t>
       </w:r>
@@ -6539,7 +6611,7 @@
         <w:pStyle w:val="Ttulo1"/>
         <w:pageBreakBefore/>
       </w:pPr>
-      <w:bookmarkStart w:id="12" w:name="_Toc243371069"/>
+      <w:bookmarkStart w:id="12" w:name="_Toc243504120"/>
       <w:r>
         <w:t>6. DEFINICIÓN Y ALCANCE</w:t>
       </w:r>
@@ -6549,7 +6621,7 @@
       <w:pPr>
         <w:pStyle w:val="Ttulo2"/>
       </w:pPr>
-      <w:bookmarkStart w:id="13" w:name="_Toc243371070"/>
+      <w:bookmarkStart w:id="13" w:name="_Toc243504121"/>
       <w:r>
         <w:t>6.1 Funcionamiento general</w:t>
       </w:r>
@@ -6574,6 +6646,15 @@
       </w:pPr>
       <w:r>
         <w:t>Los controladores reciben y devuelven JSON y validan la entrada con Bean Validation. Luego delegan en la capa de servicios, que ejecuta las reglas de negocio dentro de transacciones y persiste mediante repositorios de Spring Data JPA. Los errores se traducen a respuestas JSON con un formato uniforme y el código HTTP correspondiente.</w:t>
+      </w:r>
+    </w:p>
+    <w:p>
+      <w:pPr>
+        <w:spacing w:after="120"/>
+        <w:jc w:val="both"/>
+      </w:pPr>
+      <w:r>
+        <w:t>La interfaz web (HTML, CSS y JavaScript) se publica desde el mismo servidor Spring Boot. No tiene lógica de negocio propia: obtiene el token con el servicio de login, lo guarda durante la sesión del navegador y llama a los mismos servicios REST que se prueban en Postman. Así, cualquier validación o regla del servidor se refleja igual en la interfaz.</w:t>
       </w:r>
     </w:p>
     <w:p>
@@ -7363,7 +7444,7 @@
       <w:pPr>
         <w:pStyle w:val="Ttulo2"/>
       </w:pPr>
-      <w:bookmarkStart w:id="14" w:name="_Toc243371071"/>
+      <w:bookmarkStart w:id="14" w:name="_Toc243504122"/>
       <w:r>
         <w:t>6.2 Arquitectura y tecnologías</w:t>
       </w:r>
@@ -7639,7 +7720,7 @@
                 <w:sz w:val="19"/>
                 <w:szCs w:val="19"/>
               </w:rPr>
-              <w:t>Presentación REST (controller)</w:t>
+              <w:t>Interfaz web (static)</w:t>
             </w:r>
           </w:p>
         </w:tc>
@@ -7667,7 +7748,7 @@
                 <w:sz w:val="19"/>
                 <w:szCs w:val="19"/>
               </w:rPr>
-              <w:t>Auth, Cliente, Vehiculo, Contrato, Pago, Mantenimiento, Usuario</w:t>
+              <w:t>index.html, css/app.css, js/app.js</w:t>
             </w:r>
           </w:p>
         </w:tc>
@@ -7695,7 +7776,7 @@
                 <w:sz w:val="19"/>
                 <w:szCs w:val="19"/>
               </w:rPr>
-              <w:t>Spring MVC (@RestController), springdoc-openapi</w:t>
+              <w:t>HTML5, CSS y JavaScript (fetch + JWT)</w:t>
             </w:r>
           </w:p>
         </w:tc>
@@ -7730,7 +7811,7 @@
                 <w:sz w:val="19"/>
                 <w:szCs w:val="19"/>
               </w:rPr>
-              <w:t>Transferencia (dto)</w:t>
+              <w:t>Presentación REST (controller)</w:t>
             </w:r>
           </w:p>
         </w:tc>
@@ -7757,7 +7838,7 @@
                 <w:sz w:val="19"/>
                 <w:szCs w:val="19"/>
               </w:rPr>
-              <w:t>Request/Response por recurso, ApiError</w:t>
+              <w:t>Auth, Cliente, Vehiculo, Contrato, Pago, Mantenimiento, Usuario</w:t>
             </w:r>
           </w:p>
         </w:tc>
@@ -7784,7 +7865,7 @@
                 <w:sz w:val="19"/>
                 <w:szCs w:val="19"/>
               </w:rPr>
-              <w:t>Bean Validation (Jakarta), Lombok @Data @Builder</w:t>
+              <w:t>Spring MVC (@RestController), springdoc-openapi</w:t>
             </w:r>
           </w:p>
         </w:tc>
@@ -7820,7 +7901,7 @@
                 <w:sz w:val="19"/>
                 <w:szCs w:val="19"/>
               </w:rPr>
-              <w:t>Negocio (service)</w:t>
+              <w:t>Transferencia (dto)</w:t>
             </w:r>
           </w:p>
         </w:tc>
@@ -7848,7 +7929,7 @@
                 <w:sz w:val="19"/>
                 <w:szCs w:val="19"/>
               </w:rPr>
-              <w:t>Interfaces + implementaciones, CalculadoraContrato</w:t>
+              <w:t>Request/Response por recurso, ApiError</w:t>
             </w:r>
           </w:p>
         </w:tc>
@@ -7876,7 +7957,7 @@
                 <w:sz w:val="19"/>
                 <w:szCs w:val="19"/>
               </w:rPr>
-              <w:t>Spring @Service, @Transactional</w:t>
+              <w:t>Bean Validation (Jakarta), Lombok @Data @Builder</w:t>
             </w:r>
           </w:p>
         </w:tc>
@@ -7911,7 +7992,7 @@
                 <w:sz w:val="19"/>
                 <w:szCs w:val="19"/>
               </w:rPr>
-              <w:t>Acceso a datos (repository)</w:t>
+              <w:t>Negocio (service)</w:t>
             </w:r>
           </w:p>
         </w:tc>
@@ -7938,7 +8019,7 @@
                 <w:sz w:val="19"/>
                 <w:szCs w:val="19"/>
               </w:rPr>
-              <w:t>6 repositorios con consultas derivadas, JPQL y @EntityGraph</w:t>
+              <w:t>Interfaces + implementaciones, CalculadoraContrato</w:t>
             </w:r>
           </w:p>
         </w:tc>
@@ -7965,7 +8046,7 @@
                 <w:sz w:val="19"/>
                 <w:szCs w:val="19"/>
               </w:rPr>
-              <w:t>Spring Data JPA, Hibernate 6</w:t>
+              <w:t>Spring @Service, @Transactional</w:t>
             </w:r>
           </w:p>
         </w:tc>
@@ -8001,7 +8082,7 @@
                 <w:sz w:val="19"/>
                 <w:szCs w:val="19"/>
               </w:rPr>
-              <w:t>Dominio (entity)</w:t>
+              <w:t>Acceso a datos (repository)</w:t>
             </w:r>
           </w:p>
         </w:tc>
@@ -8029,7 +8110,7 @@
                 <w:sz w:val="19"/>
                 <w:szCs w:val="19"/>
               </w:rPr>
-              <w:t>Usuario, Cliente, Vehiculo, Contrato, Pago, Mantenimiento + enums</w:t>
+              <w:t>6 repositorios con consultas derivadas, JPQL y @EntityGraph</w:t>
             </w:r>
           </w:p>
         </w:tc>
@@ -8057,7 +8138,7 @@
                 <w:sz w:val="19"/>
                 <w:szCs w:val="19"/>
               </w:rPr>
-              <w:t>JPA, Lombok @Getter @Setter @Builder</w:t>
+              <w:t>Spring Data JPA, Hibernate 6</w:t>
             </w:r>
           </w:p>
         </w:tc>
@@ -8092,7 +8173,7 @@
                 <w:sz w:val="19"/>
                 <w:szCs w:val="19"/>
               </w:rPr>
-              <w:t>Persistencia</w:t>
+              <w:t>Dominio (entity)</w:t>
             </w:r>
           </w:p>
         </w:tc>
@@ -8119,7 +8200,7 @@
                 <w:sz w:val="19"/>
                 <w:szCs w:val="19"/>
               </w:rPr>
-              <w:t>Base de datos chd_rental</w:t>
+              <w:t>Usuario, Cliente, Vehiculo, Contrato, Pago, Mantenimiento + enums</w:t>
             </w:r>
           </w:p>
         </w:tc>
@@ -8146,7 +8227,7 @@
                 <w:sz w:val="19"/>
                 <w:szCs w:val="19"/>
               </w:rPr>
-              <w:t>PostgreSQL 16 (H2 para pruebas)</w:t>
+              <w:t>JPA, Lombok @Getter @Setter @Builder</w:t>
             </w:r>
           </w:p>
         </w:tc>
@@ -8182,6 +8263,97 @@
                 <w:sz w:val="19"/>
                 <w:szCs w:val="19"/>
               </w:rPr>
+              <w:t>Persistencia</w:t>
+            </w:r>
+          </w:p>
+        </w:tc>
+        <w:tc>
+          <w:tcPr>
+            <w:tcW w:w="3800" w:type="dxa"/>
+            <w:tcBorders>
+              <w:top w:val="single" w:sz="4" w:space="0" w:color="A6B0C3"/>
+              <w:left w:val="single" w:sz="4" w:space="0" w:color="A6B0C3"/>
+              <w:bottom w:val="single" w:sz="4" w:space="0" w:color="A6B0C3"/>
+              <w:right w:val="single" w:sz="4" w:space="0" w:color="A6B0C3"/>
+            </w:tcBorders>
+            <w:shd w:val="clear" w:color="auto" w:fill="EEF2F8"/>
+            <w:tcMar>
+              <w:top w:w="50" w:type="dxa"/>
+              <w:left w:w="90" w:type="dxa"/>
+              <w:bottom w:w="50" w:type="dxa"/>
+              <w:right w:w="90" w:type="dxa"/>
+            </w:tcMar>
+            <w:vAlign w:val="center"/>
+          </w:tcPr>
+          <w:p>
+            <w:r>
+              <w:rPr>
+                <w:sz w:val="19"/>
+                <w:szCs w:val="19"/>
+              </w:rPr>
+              <w:t>Base de datos chd_rental</w:t>
+            </w:r>
+          </w:p>
+        </w:tc>
+        <w:tc>
+          <w:tcPr>
+            <w:tcW w:w="2971" w:type="dxa"/>
+            <w:tcBorders>
+              <w:top w:val="single" w:sz="4" w:space="0" w:color="A6B0C3"/>
+              <w:left w:val="single" w:sz="4" w:space="0" w:color="A6B0C3"/>
+              <w:bottom w:val="single" w:sz="4" w:space="0" w:color="A6B0C3"/>
+              <w:right w:val="single" w:sz="4" w:space="0" w:color="A6B0C3"/>
+            </w:tcBorders>
+            <w:shd w:val="clear" w:color="auto" w:fill="EEF2F8"/>
+            <w:tcMar>
+              <w:top w:w="50" w:type="dxa"/>
+              <w:left w:w="90" w:type="dxa"/>
+              <w:bottom w:w="50" w:type="dxa"/>
+              <w:right w:w="90" w:type="dxa"/>
+            </w:tcMar>
+            <w:vAlign w:val="center"/>
+          </w:tcPr>
+          <w:p>
+            <w:r>
+              <w:rPr>
+                <w:sz w:val="19"/>
+                <w:szCs w:val="19"/>
+              </w:rPr>
+              <w:t>PostgreSQL 16 (H2 para pruebas)</w:t>
+            </w:r>
+          </w:p>
+        </w:tc>
+      </w:tr>
+      <w:tr>
+        <w:tblPrEx>
+          <w:tblCellMar>
+            <w:top w:w="0" w:type="dxa"/>
+            <w:bottom w:w="0" w:type="dxa"/>
+          </w:tblCellMar>
+        </w:tblPrEx>
+        <w:tc>
+          <w:tcPr>
+            <w:tcW w:w="2300" w:type="dxa"/>
+            <w:tcBorders>
+              <w:top w:val="single" w:sz="4" w:space="0" w:color="A6B0C3"/>
+              <w:left w:val="single" w:sz="4" w:space="0" w:color="A6B0C3"/>
+              <w:bottom w:val="single" w:sz="4" w:space="0" w:color="A6B0C3"/>
+              <w:right w:val="single" w:sz="4" w:space="0" w:color="A6B0C3"/>
+            </w:tcBorders>
+            <w:tcMar>
+              <w:top w:w="50" w:type="dxa"/>
+              <w:left w:w="90" w:type="dxa"/>
+              <w:bottom w:w="50" w:type="dxa"/>
+              <w:right w:w="90" w:type="dxa"/>
+            </w:tcMar>
+            <w:vAlign w:val="center"/>
+          </w:tcPr>
+          <w:p>
+            <w:r>
+              <w:rPr>
+                <w:sz w:val="19"/>
+                <w:szCs w:val="19"/>
+              </w:rPr>
               <w:t>Nube</w:t>
             </w:r>
           </w:p>
@@ -8195,7 +8367,6 @@
               <w:bottom w:val="single" w:sz="4" w:space="0" w:color="A6B0C3"/>
               <w:right w:val="single" w:sz="4" w:space="0" w:color="A6B0C3"/>
             </w:tcBorders>
-            <w:shd w:val="clear" w:color="auto" w:fill="EEF2F8"/>
             <w:tcMar>
               <w:top w:w="50" w:type="dxa"/>
               <w:left w:w="90" w:type="dxa"/>
@@ -8223,7 +8394,6 @@
               <w:bottom w:val="single" w:sz="4" w:space="0" w:color="A6B0C3"/>
               <w:right w:val="single" w:sz="4" w:space="0" w:color="A6B0C3"/>
             </w:tcBorders>
-            <w:shd w:val="clear" w:color="auto" w:fill="EEF2F8"/>
             <w:tcMar>
               <w:top w:w="50" w:type="dxa"/>
               <w:left w:w="90" w:type="dxa"/>
@@ -8248,7 +8418,7 @@
       <w:pPr>
         <w:pStyle w:val="Ttulo2"/>
       </w:pPr>
-      <w:bookmarkStart w:id="15" w:name="_Toc243371072"/>
+      <w:bookmarkStart w:id="15" w:name="_Toc243504123"/>
       <w:r>
         <w:t>6.3 Seguridad: login con BCrypt, JWT y roles</w:t>
       </w:r>
@@ -9073,7 +9243,7 @@
       <w:pPr>
         <w:pStyle w:val="Ttulo2"/>
       </w:pPr>
-      <w:bookmarkStart w:id="16" w:name="_Toc243371073"/>
+      <w:bookmarkStart w:id="16" w:name="_Toc243504124"/>
       <w:r>
         <w:t>6.4 Catálogo de servicios web REST</w:t>
       </w:r>
@@ -10795,7 +10965,7 @@
       <w:pPr>
         <w:pStyle w:val="Ttulo2"/>
       </w:pPr>
-      <w:bookmarkStart w:id="17" w:name="_Toc243371074"/>
+      <w:bookmarkStart w:id="17" w:name="_Toc243504125"/>
       <w:r>
         <w:t>6.5 Modelo de datos</w:t>
       </w:r>
@@ -11696,7 +11866,7 @@
       <w:pPr>
         <w:pStyle w:val="Ttulo2"/>
       </w:pPr>
-      <w:bookmarkStart w:id="18" w:name="_Toc243371075"/>
+      <w:bookmarkStart w:id="18" w:name="_Toc243504126"/>
       <w:r>
         <w:t>6.6 Reglas de negocio implementadas</w:t>
       </w:r>
@@ -11811,7 +11981,7 @@
       <w:pPr>
         <w:pStyle w:val="Ttulo2"/>
       </w:pPr>
-      <w:bookmarkStart w:id="19" w:name="_Toc243371076"/>
+      <w:bookmarkStart w:id="19" w:name="_Toc243504127"/>
       <w:r>
         <w:t>6.7 Buenas prácticas y patrones de diseño</w:t>
       </w:r>
@@ -12632,7 +12802,7 @@
       <w:pPr>
         <w:pStyle w:val="Ttulo2"/>
       </w:pPr>
-      <w:bookmarkStart w:id="20" w:name="_Toc243371077"/>
+      <w:bookmarkStart w:id="20" w:name="_Toc243504128"/>
       <w:r>
         <w:t>6.8 Exposición en la nube</w:t>
       </w:r>
@@ -13148,7 +13318,7 @@
       <w:pPr>
         <w:pStyle w:val="Ttulo2"/>
       </w:pPr>
-      <w:bookmarkStart w:id="21" w:name="_Toc243371078"/>
+      <w:bookmarkStart w:id="21" w:name="_Toc243504129"/>
       <w:r>
         <w:t>6.9 Fuera del alcance</w:t>
       </w:r>
@@ -13165,7 +13335,7 @@
         <w:jc w:val="both"/>
       </w:pPr>
       <w:r>
-        <w:t>Interfaz web completa de usuario final (la API se consume desde Swagger UI, Postman o la página de prueba incluida).</w:t>
+        <w:t>Pasarela de pagos real y facturación electrónica ante SUNAT.</w:t>
       </w:r>
     </w:p>
     <w:p>
@@ -13179,20 +13349,6 @@
         <w:jc w:val="both"/>
       </w:pPr>
       <w:r>
-        <w:t>Pasarela de pagos real y facturación electrónica ante SUNAT.</w:t>
-      </w:r>
-    </w:p>
-    <w:p>
-      <w:pPr>
-        <w:pStyle w:val="Prrafodelista"/>
-        <w:numPr>
-          <w:ilvl w:val="0"/>
-          <w:numId w:val="2"/>
-        </w:numPr>
-        <w:spacing w:after="60"/>
-        <w:jc w:val="both"/>
-      </w:pPr>
-      <w:r>
         <w:t>Rastreo GPS y aplicación móvil nativa.</w:t>
       </w:r>
     </w:p>
@@ -13200,7 +13356,7 @@
       <w:pPr>
         <w:pStyle w:val="Ttulo2"/>
       </w:pPr>
-      <w:bookmarkStart w:id="22" w:name="_Toc243371079"/>
+      <w:bookmarkStart w:id="22" w:name="_Toc243504130"/>
       <w:r>
         <w:t>6.10 Documentación entregada</w:t>
       </w:r>
@@ -13657,7 +13813,7 @@
                 <w:sz w:val="19"/>
                 <w:szCs w:val="19"/>
               </w:rPr>
-              <w:t>Documentación OpenAPI</w:t>
+              <w:t>Interfaz web</w:t>
             </w:r>
           </w:p>
         </w:tc>
@@ -13685,7 +13841,7 @@
                 <w:sz w:val="19"/>
                 <w:szCs w:val="19"/>
               </w:rPr>
-              <w:t>Contrato interactivo de los 32 servicios.</w:t>
+              <w:t>Login, panel de inicio y pantallas de gestión que consumen la API.</w:t>
             </w:r>
           </w:p>
         </w:tc>
@@ -13713,7 +13869,7 @@
                 <w:sz w:val="19"/>
                 <w:szCs w:val="19"/>
               </w:rPr>
-              <w:t>/swagger-ui.html y /v3/api-docs</w:t>
+              <w:t>src/main/resources/static/</w:t>
             </w:r>
           </w:p>
         </w:tc>
@@ -13748,7 +13904,7 @@
                 <w:sz w:val="19"/>
                 <w:szCs w:val="19"/>
               </w:rPr>
-              <w:t>Colecciones Postman</w:t>
+              <w:t>Documentación OpenAPI</w:t>
             </w:r>
           </w:p>
         </w:tc>
@@ -13775,7 +13931,7 @@
                 <w:sz w:val="19"/>
                 <w:szCs w:val="19"/>
               </w:rPr>
-              <w:t>Local y nube (Render); guardan el token y validan cada respuesta.</w:t>
+              <w:t>Contrato interactivo de los 32 servicios.</w:t>
             </w:r>
           </w:p>
         </w:tc>
@@ -13802,7 +13958,7 @@
                 <w:sz w:val="19"/>
                 <w:szCs w:val="19"/>
               </w:rPr>
-              <w:t>docs/postman/</w:t>
+              <w:t>/swagger-ui.html y /v3/api-docs</w:t>
             </w:r>
           </w:p>
         </w:tc>
@@ -13838,7 +13994,7 @@
                 <w:sz w:val="19"/>
                 <w:szCs w:val="19"/>
               </w:rPr>
-              <w:t>Pruebas automatizadas</w:t>
+              <w:t>Colecciones Postman</w:t>
             </w:r>
           </w:p>
         </w:tc>
@@ -13866,7 +14022,7 @@
                 <w:sz w:val="19"/>
                 <w:szCs w:val="19"/>
               </w:rPr>
-              <w:t>42 pruebas JUnit 5 (capa de datos, servicios y seguridad).</w:t>
+              <w:t>Local y nube (Render); guardan el token y validan cada respuesta.</w:t>
             </w:r>
           </w:p>
         </w:tc>
@@ -13894,7 +14050,7 @@
                 <w:sz w:val="19"/>
                 <w:szCs w:val="19"/>
               </w:rPr>
-              <w:t>src/test/</w:t>
+              <w:t>docs/postman/</w:t>
             </w:r>
           </w:p>
         </w:tc>
@@ -13929,7 +14085,7 @@
                 <w:sz w:val="19"/>
                 <w:szCs w:val="19"/>
               </w:rPr>
-              <w:t>Evidencias</w:t>
+              <w:t>Pruebas automatizadas</w:t>
             </w:r>
           </w:p>
         </w:tc>
@@ -13956,7 +14112,7 @@
                 <w:sz w:val="19"/>
                 <w:szCs w:val="19"/>
               </w:rPr>
-              <w:t>Capturas de cada servicio y de la base de datos.</w:t>
+              <w:t>42 pruebas JUnit 5 (capa de datos, servicios y seguridad).</w:t>
             </w:r>
           </w:p>
         </w:tc>
@@ -13983,7 +14139,7 @@
                 <w:sz w:val="19"/>
                 <w:szCs w:val="19"/>
               </w:rPr>
-              <w:t>docs/evidencias/</w:t>
+              <w:t>src/test/</w:t>
             </w:r>
           </w:p>
         </w:tc>
@@ -14019,6 +14175,97 @@
                 <w:sz w:val="19"/>
                 <w:szCs w:val="19"/>
               </w:rPr>
+              <w:t>Evidencias</w:t>
+            </w:r>
+          </w:p>
+        </w:tc>
+        <w:tc>
+          <w:tcPr>
+            <w:tcW w:w="4000" w:type="dxa"/>
+            <w:tcBorders>
+              <w:top w:val="single" w:sz="4" w:space="0" w:color="A6B0C3"/>
+              <w:left w:val="single" w:sz="4" w:space="0" w:color="A6B0C3"/>
+              <w:bottom w:val="single" w:sz="4" w:space="0" w:color="A6B0C3"/>
+              <w:right w:val="single" w:sz="4" w:space="0" w:color="A6B0C3"/>
+            </w:tcBorders>
+            <w:shd w:val="clear" w:color="auto" w:fill="EEF2F8"/>
+            <w:tcMar>
+              <w:top w:w="50" w:type="dxa"/>
+              <w:left w:w="90" w:type="dxa"/>
+              <w:bottom w:w="50" w:type="dxa"/>
+              <w:right w:w="90" w:type="dxa"/>
+            </w:tcMar>
+            <w:vAlign w:val="center"/>
+          </w:tcPr>
+          <w:p>
+            <w:r>
+              <w:rPr>
+                <w:sz w:val="19"/>
+                <w:szCs w:val="19"/>
+              </w:rPr>
+              <w:t>Capturas de cada servicio y de la base de datos.</w:t>
+            </w:r>
+          </w:p>
+        </w:tc>
+        <w:tc>
+          <w:tcPr>
+            <w:tcW w:w="2871" w:type="dxa"/>
+            <w:tcBorders>
+              <w:top w:val="single" w:sz="4" w:space="0" w:color="A6B0C3"/>
+              <w:left w:val="single" w:sz="4" w:space="0" w:color="A6B0C3"/>
+              <w:bottom w:val="single" w:sz="4" w:space="0" w:color="A6B0C3"/>
+              <w:right w:val="single" w:sz="4" w:space="0" w:color="A6B0C3"/>
+            </w:tcBorders>
+            <w:shd w:val="clear" w:color="auto" w:fill="EEF2F8"/>
+            <w:tcMar>
+              <w:top w:w="50" w:type="dxa"/>
+              <w:left w:w="90" w:type="dxa"/>
+              <w:bottom w:w="50" w:type="dxa"/>
+              <w:right w:w="90" w:type="dxa"/>
+            </w:tcMar>
+            <w:vAlign w:val="center"/>
+          </w:tcPr>
+          <w:p>
+            <w:r>
+              <w:rPr>
+                <w:sz w:val="19"/>
+                <w:szCs w:val="19"/>
+              </w:rPr>
+              <w:t>docs/evidencias/</w:t>
+            </w:r>
+          </w:p>
+        </w:tc>
+      </w:tr>
+      <w:tr>
+        <w:tblPrEx>
+          <w:tblCellMar>
+            <w:top w:w="0" w:type="dxa"/>
+            <w:bottom w:w="0" w:type="dxa"/>
+          </w:tblCellMar>
+        </w:tblPrEx>
+        <w:tc>
+          <w:tcPr>
+            <w:tcW w:w="2200" w:type="dxa"/>
+            <w:tcBorders>
+              <w:top w:val="single" w:sz="4" w:space="0" w:color="A6B0C3"/>
+              <w:left w:val="single" w:sz="4" w:space="0" w:color="A6B0C3"/>
+              <w:bottom w:val="single" w:sz="4" w:space="0" w:color="A6B0C3"/>
+              <w:right w:val="single" w:sz="4" w:space="0" w:color="A6B0C3"/>
+            </w:tcBorders>
+            <w:tcMar>
+              <w:top w:w="50" w:type="dxa"/>
+              <w:left w:w="90" w:type="dxa"/>
+              <w:bottom w:w="50" w:type="dxa"/>
+              <w:right w:w="90" w:type="dxa"/>
+            </w:tcMar>
+            <w:vAlign w:val="center"/>
+          </w:tcPr>
+          <w:p>
+            <w:r>
+              <w:rPr>
+                <w:sz w:val="19"/>
+                <w:szCs w:val="19"/>
+              </w:rPr>
               <w:t>Despliegue</w:t>
             </w:r>
           </w:p>
@@ -14032,7 +14279,6 @@
               <w:bottom w:val="single" w:sz="4" w:space="0" w:color="A6B0C3"/>
               <w:right w:val="single" w:sz="4" w:space="0" w:color="A6B0C3"/>
             </w:tcBorders>
-            <w:shd w:val="clear" w:color="auto" w:fill="EEF2F8"/>
             <w:tcMar>
               <w:top w:w="50" w:type="dxa"/>
               <w:left w:w="90" w:type="dxa"/>
@@ -14060,7 +14306,6 @@
               <w:bottom w:val="single" w:sz="4" w:space="0" w:color="A6B0C3"/>
               <w:right w:val="single" w:sz="4" w:space="0" w:color="A6B0C3"/>
             </w:tcBorders>
-            <w:shd w:val="clear" w:color="auto" w:fill="EEF2F8"/>
             <w:tcMar>
               <w:top w:w="50" w:type="dxa"/>
               <w:left w:w="90" w:type="dxa"/>
@@ -14086,7 +14331,7 @@
         <w:pStyle w:val="Ttulo1"/>
         <w:pageBreakBefore/>
       </w:pPr>
-      <w:bookmarkStart w:id="23" w:name="_Toc243371080"/>
+      <w:bookmarkStart w:id="23" w:name="_Toc243504131"/>
       <w:r>
         <w:t>7. PRODUCTOS Y ENTREGABLES</w:t>
       </w:r>
@@ -14362,7 +14607,7 @@
                 <w:sz w:val="19"/>
                 <w:szCs w:val="19"/>
               </w:rPr>
-              <w:t>Base de datos PostgreSQL</w:t>
+              <w:t>Interfaz web</w:t>
             </w:r>
           </w:p>
         </w:tc>
@@ -14390,7 +14635,7 @@
                 <w:sz w:val="19"/>
                 <w:szCs w:val="19"/>
               </w:rPr>
-              <w:t>6 tablas, restricciones, índices y datos de ejemplo.</w:t>
+              <w:t>Login, panel de inicio y gestión de los seis recursos, en la misma URL de Render.</w:t>
             </w:r>
           </w:p>
         </w:tc>
@@ -14418,7 +14663,7 @@
                 <w:sz w:val="19"/>
                 <w:szCs w:val="19"/>
               </w:rPr>
-              <w:t>Terminado</w:t>
+              <w:t>Publicada y verificada</w:t>
             </w:r>
           </w:p>
         </w:tc>
@@ -14453,7 +14698,7 @@
                 <w:sz w:val="19"/>
                 <w:szCs w:val="19"/>
               </w:rPr>
-              <w:t>Pruebas automatizadas</w:t>
+              <w:t>Base de datos PostgreSQL</w:t>
             </w:r>
           </w:p>
         </w:tc>
@@ -14480,7 +14725,7 @@
                 <w:sz w:val="19"/>
                 <w:szCs w:val="19"/>
               </w:rPr>
-              <w:t>42 pruebas (26 de la capa de acceso a datos).</w:t>
+              <w:t>6 tablas, restricciones, índices y datos de ejemplo.</w:t>
             </w:r>
           </w:p>
         </w:tc>
@@ -14507,7 +14752,7 @@
                 <w:sz w:val="19"/>
                 <w:szCs w:val="19"/>
               </w:rPr>
-              <w:t>Terminado — 42/42 OK</w:t>
+              <w:t>Terminado</w:t>
             </w:r>
           </w:p>
         </w:tc>
@@ -14543,7 +14788,7 @@
                 <w:sz w:val="19"/>
                 <w:szCs w:val="19"/>
               </w:rPr>
-              <w:t>Despliegue en la nube</w:t>
+              <w:t>Pruebas automatizadas</w:t>
             </w:r>
           </w:p>
         </w:tc>
@@ -14571,7 +14816,7 @@
                 <w:sz w:val="19"/>
                 <w:szCs w:val="19"/>
               </w:rPr>
-              <w:t>API y PostgreSQL publicados en Render: https://chd-rental-api.onrender.com</w:t>
+              <w:t>42 pruebas (26 de la capa de acceso a datos).</w:t>
             </w:r>
           </w:p>
         </w:tc>
@@ -14599,7 +14844,7 @@
                 <w:sz w:val="19"/>
                 <w:szCs w:val="19"/>
               </w:rPr>
-              <w:t>Publicado y verificado</w:t>
+              <w:t>Terminado — 42/42 OK</w:t>
             </w:r>
           </w:p>
         </w:tc>
@@ -14634,7 +14879,7 @@
                 <w:sz w:val="19"/>
                 <w:szCs w:val="19"/>
               </w:rPr>
-              <w:t>Documentación</w:t>
+              <w:t>Despliegue en la nube</w:t>
             </w:r>
           </w:p>
         </w:tc>
@@ -14661,7 +14906,7 @@
                 <w:sz w:val="19"/>
                 <w:szCs w:val="19"/>
               </w:rPr>
-              <w:t>README, Swagger/OpenAPI, colecciones Postman (local y nube), evidencias.</w:t>
+              <w:t>API y PostgreSQL publicados en Render: https://chd-rental-api.onrender.com</w:t>
             </w:r>
           </w:p>
         </w:tc>
@@ -14688,7 +14933,7 @@
                 <w:sz w:val="19"/>
                 <w:szCs w:val="19"/>
               </w:rPr>
-              <w:t>Terminado</w:t>
+              <w:t>Publicado y verificado</w:t>
             </w:r>
           </w:p>
         </w:tc>
@@ -14724,7 +14969,7 @@
                 <w:sz w:val="19"/>
                 <w:szCs w:val="19"/>
               </w:rPr>
-              <w:t>Informe final</w:t>
+              <w:t>Documentación</w:t>
             </w:r>
           </w:p>
         </w:tc>
@@ -14752,7 +14997,7 @@
                 <w:sz w:val="19"/>
                 <w:szCs w:val="19"/>
               </w:rPr>
-              <w:t>Este documento (formato Word editable).</w:t>
+              <w:t>README, Swagger/OpenAPI, colecciones Postman (local y nube), evidencias.</w:t>
             </w:r>
           </w:p>
         </w:tc>
@@ -14815,7 +15060,7 @@
                 <w:sz w:val="19"/>
                 <w:szCs w:val="19"/>
               </w:rPr>
-              <w:t>Presentación</w:t>
+              <w:t>Informe final</w:t>
             </w:r>
           </w:p>
         </w:tc>
@@ -14842,7 +15087,7 @@
                 <w:sz w:val="19"/>
                 <w:szCs w:val="19"/>
               </w:rPr>
-              <w:t>Diapositivas para la sustentación (*.ppt).</w:t>
+              <w:t>Este documento (formato Word editable).</w:t>
             </w:r>
           </w:p>
         </w:tc>
@@ -14869,7 +15114,7 @@
                 <w:sz w:val="19"/>
                 <w:szCs w:val="19"/>
               </w:rPr>
-              <w:t>Por elaborar</w:t>
+              <w:t>Terminado</w:t>
             </w:r>
           </w:p>
         </w:tc>
@@ -14905,6 +15150,97 @@
                 <w:sz w:val="19"/>
                 <w:szCs w:val="19"/>
               </w:rPr>
+              <w:t>Presentación</w:t>
+            </w:r>
+          </w:p>
+        </w:tc>
+        <w:tc>
+          <w:tcPr>
+            <w:tcW w:w="4471" w:type="dxa"/>
+            <w:tcBorders>
+              <w:top w:val="single" w:sz="4" w:space="0" w:color="A6B0C3"/>
+              <w:left w:val="single" w:sz="4" w:space="0" w:color="A6B0C3"/>
+              <w:bottom w:val="single" w:sz="4" w:space="0" w:color="A6B0C3"/>
+              <w:right w:val="single" w:sz="4" w:space="0" w:color="A6B0C3"/>
+            </w:tcBorders>
+            <w:shd w:val="clear" w:color="auto" w:fill="EEF2F8"/>
+            <w:tcMar>
+              <w:top w:w="50" w:type="dxa"/>
+              <w:left w:w="90" w:type="dxa"/>
+              <w:bottom w:w="50" w:type="dxa"/>
+              <w:right w:w="90" w:type="dxa"/>
+            </w:tcMar>
+            <w:vAlign w:val="center"/>
+          </w:tcPr>
+          <w:p>
+            <w:r>
+              <w:rPr>
+                <w:sz w:val="19"/>
+                <w:szCs w:val="19"/>
+              </w:rPr>
+              <w:t>Diapositivas para la sustentación (.ppt y .pptx), 16 diapositivas.</w:t>
+            </w:r>
+          </w:p>
+        </w:tc>
+        <w:tc>
+          <w:tcPr>
+            <w:tcW w:w="2200" w:type="dxa"/>
+            <w:tcBorders>
+              <w:top w:val="single" w:sz="4" w:space="0" w:color="A6B0C3"/>
+              <w:left w:val="single" w:sz="4" w:space="0" w:color="A6B0C3"/>
+              <w:bottom w:val="single" w:sz="4" w:space="0" w:color="A6B0C3"/>
+              <w:right w:val="single" w:sz="4" w:space="0" w:color="A6B0C3"/>
+            </w:tcBorders>
+            <w:shd w:val="clear" w:color="auto" w:fill="EEF2F8"/>
+            <w:tcMar>
+              <w:top w:w="50" w:type="dxa"/>
+              <w:left w:w="90" w:type="dxa"/>
+              <w:bottom w:w="50" w:type="dxa"/>
+              <w:right w:w="90" w:type="dxa"/>
+            </w:tcMar>
+            <w:vAlign w:val="center"/>
+          </w:tcPr>
+          <w:p>
+            <w:r>
+              <w:rPr>
+                <w:sz w:val="19"/>
+                <w:szCs w:val="19"/>
+              </w:rPr>
+              <w:t>Terminado</w:t>
+            </w:r>
+          </w:p>
+        </w:tc>
+      </w:tr>
+      <w:tr>
+        <w:tblPrEx>
+          <w:tblCellMar>
+            <w:top w:w="0" w:type="dxa"/>
+            <w:bottom w:w="0" w:type="dxa"/>
+          </w:tblCellMar>
+        </w:tblPrEx>
+        <w:tc>
+          <w:tcPr>
+            <w:tcW w:w="2400" w:type="dxa"/>
+            <w:tcBorders>
+              <w:top w:val="single" w:sz="4" w:space="0" w:color="A6B0C3"/>
+              <w:left w:val="single" w:sz="4" w:space="0" w:color="A6B0C3"/>
+              <w:bottom w:val="single" w:sz="4" w:space="0" w:color="A6B0C3"/>
+              <w:right w:val="single" w:sz="4" w:space="0" w:color="A6B0C3"/>
+            </w:tcBorders>
+            <w:tcMar>
+              <w:top w:w="50" w:type="dxa"/>
+              <w:left w:w="90" w:type="dxa"/>
+              <w:bottom w:w="50" w:type="dxa"/>
+              <w:right w:w="90" w:type="dxa"/>
+            </w:tcMar>
+            <w:vAlign w:val="center"/>
+          </w:tcPr>
+          <w:p>
+            <w:r>
+              <w:rPr>
+                <w:sz w:val="19"/>
+                <w:szCs w:val="19"/>
+              </w:rPr>
               <w:t>Video demo reel</w:t>
             </w:r>
           </w:p>
@@ -14918,7 +15254,6 @@
               <w:bottom w:val="single" w:sz="4" w:space="0" w:color="A6B0C3"/>
               <w:right w:val="single" w:sz="4" w:space="0" w:color="A6B0C3"/>
             </w:tcBorders>
-            <w:shd w:val="clear" w:color="auto" w:fill="EEF2F8"/>
             <w:tcMar>
               <w:top w:w="50" w:type="dxa"/>
               <w:left w:w="90" w:type="dxa"/>
@@ -14946,22 +15281,21 @@
               <w:bottom w:val="single" w:sz="4" w:space="0" w:color="A6B0C3"/>
               <w:right w:val="single" w:sz="4" w:space="0" w:color="A6B0C3"/>
             </w:tcBorders>
-            <w:shd w:val="clear" w:color="auto" w:fill="EEF2F8"/>
-            <w:tcMar>
-              <w:top w:w="50" w:type="dxa"/>
-              <w:left w:w="90" w:type="dxa"/>
-              <w:bottom w:w="50" w:type="dxa"/>
-              <w:right w:w="90" w:type="dxa"/>
-            </w:tcMar>
-            <w:vAlign w:val="center"/>
-          </w:tcPr>
-          <w:p>
-            <w:r>
-              <w:rPr>
-                <w:sz w:val="19"/>
-                <w:szCs w:val="19"/>
-              </w:rPr>
-              <w:t>Por grabar (guion en 7.5)</w:t>
+            <w:tcMar>
+              <w:top w:w="50" w:type="dxa"/>
+              <w:left w:w="90" w:type="dxa"/>
+              <w:bottom w:w="50" w:type="dxa"/>
+              <w:right w:w="90" w:type="dxa"/>
+            </w:tcMar>
+            <w:vAlign w:val="center"/>
+          </w:tcPr>
+          <w:p>
+            <w:r>
+              <w:rPr>
+                <w:sz w:val="19"/>
+                <w:szCs w:val="19"/>
+              </w:rPr>
+              <w:t>Por grabar (guion en 7.6)</w:t>
             </w:r>
           </w:p>
         </w:tc>
@@ -14971,7 +15305,7 @@
       <w:pPr>
         <w:pStyle w:val="Ttulo2"/>
       </w:pPr>
-      <w:bookmarkStart w:id="24" w:name="_Toc243371081"/>
+      <w:bookmarkStart w:id="24" w:name="_Toc243504132"/>
       <w:r>
         <w:t>7.1 Servicio REST de login</w:t>
       </w:r>
@@ -14997,10 +15331,10 @@
           <w:noProof/>
         </w:rPr>
         <w:drawing>
-          <wp:inline distT="0" distB="0" distL="0" distR="0" wp14:anchorId="46B2F63F" wp14:editId="5A9DB696">
+          <wp:inline distT="0" distB="0" distL="0" distR="0" wp14:anchorId="51F88DCB" wp14:editId="4764778B">
             <wp:extent cx="5715000" cy="2447925"/>
             <wp:effectExtent l="0" t="0" r="0" b="0"/>
-            <wp:docPr id="298624844" name="Imagen 298624844"/>
+            <wp:docPr id="1515514631" name="Imagen 1515514631"/>
             <wp:cNvGraphicFramePr>
               <a:graphicFrameLocks xmlns:a="http://schemas.openxmlformats.org/drawingml/2006/main" noChangeAspect="1"/>
             </wp:cNvGraphicFramePr>
@@ -15071,10 +15405,10 @@
           <w:noProof/>
         </w:rPr>
         <w:drawing>
-          <wp:inline distT="0" distB="0" distL="0" distR="0" wp14:anchorId="6F728150" wp14:editId="16D7DEB0">
+          <wp:inline distT="0" distB="0" distL="0" distR="0" wp14:anchorId="744ADE51" wp14:editId="773FCCEC">
             <wp:extent cx="5715000" cy="1600200"/>
             <wp:effectExtent l="0" t="0" r="0" b="0"/>
-            <wp:docPr id="1619454089" name="Imagen 1619454089"/>
+            <wp:docPr id="1283089547" name="Imagen 1283089547"/>
             <wp:cNvGraphicFramePr>
               <a:graphicFrameLocks xmlns:a="http://schemas.openxmlformats.org/drawingml/2006/main" noChangeAspect="1"/>
             </wp:cNvGraphicFramePr>
@@ -15145,10 +15479,10 @@
           <w:noProof/>
         </w:rPr>
         <w:drawing>
-          <wp:inline distT="0" distB="0" distL="0" distR="0" wp14:anchorId="7286CCE4" wp14:editId="386F478E">
+          <wp:inline distT="0" distB="0" distL="0" distR="0" wp14:anchorId="65A5718B" wp14:editId="1701CC6C">
             <wp:extent cx="5715000" cy="1333500"/>
             <wp:effectExtent l="0" t="0" r="0" b="0"/>
-            <wp:docPr id="2123699830" name="Imagen 2123699830"/>
+            <wp:docPr id="1897792587" name="Imagen 1897792587"/>
             <wp:cNvGraphicFramePr>
               <a:graphicFrameLocks xmlns:a="http://schemas.openxmlformats.org/drawingml/2006/main" noChangeAspect="1"/>
             </wp:cNvGraphicFramePr>
@@ -15219,10 +15553,10 @@
           <w:noProof/>
         </w:rPr>
         <w:drawing>
-          <wp:inline distT="0" distB="0" distL="0" distR="0" wp14:anchorId="2018EED3" wp14:editId="778EDF21">
+          <wp:inline distT="0" distB="0" distL="0" distR="0" wp14:anchorId="3B0C066E" wp14:editId="575F7078">
             <wp:extent cx="5715000" cy="1695450"/>
             <wp:effectExtent l="0" t="0" r="0" b="0"/>
-            <wp:docPr id="476347030" name="Imagen 476347030"/>
+            <wp:docPr id="66903172" name="Imagen 66903172"/>
             <wp:cNvGraphicFramePr>
               <a:graphicFrameLocks xmlns:a="http://schemas.openxmlformats.org/drawingml/2006/main" noChangeAspect="1"/>
             </wp:cNvGraphicFramePr>
@@ -15286,7 +15620,7 @@
       <w:pPr>
         <w:pStyle w:val="Ttulo2"/>
       </w:pPr>
-      <w:bookmarkStart w:id="25" w:name="_Toc243371082"/>
+      <w:bookmarkStart w:id="25" w:name="_Toc243504133"/>
       <w:r>
         <w:t>7.2 Servicios GET, POST, PUT y DELETE</w:t>
       </w:r>
@@ -15303,10 +15637,10 @@
           <w:noProof/>
         </w:rPr>
         <w:drawing>
-          <wp:inline distT="0" distB="0" distL="0" distR="0" wp14:anchorId="3F12E3F5" wp14:editId="52C0084B">
+          <wp:inline distT="0" distB="0" distL="0" distR="0" wp14:anchorId="036A8284" wp14:editId="281DAA0B">
             <wp:extent cx="5715000" cy="5000625"/>
             <wp:effectExtent l="0" t="0" r="0" b="0"/>
-            <wp:docPr id="3020249" name="Imagen 3020249"/>
+            <wp:docPr id="1631364631" name="Imagen 1631364631"/>
             <wp:cNvGraphicFramePr>
               <a:graphicFrameLocks xmlns:a="http://schemas.openxmlformats.org/drawingml/2006/main" noChangeAspect="1"/>
             </wp:cNvGraphicFramePr>
@@ -15377,10 +15711,10 @@
           <w:noProof/>
         </w:rPr>
         <w:drawing>
-          <wp:inline distT="0" distB="0" distL="0" distR="0" wp14:anchorId="2C0AFA5E" wp14:editId="3C33A8D0">
+          <wp:inline distT="0" distB="0" distL="0" distR="0" wp14:anchorId="1511224B" wp14:editId="4D5D56DC">
             <wp:extent cx="5715000" cy="2352675"/>
             <wp:effectExtent l="0" t="0" r="0" b="0"/>
-            <wp:docPr id="1606756105" name="Imagen 1606756105"/>
+            <wp:docPr id="2119322709" name="Imagen 2119322709"/>
             <wp:cNvGraphicFramePr>
               <a:graphicFrameLocks xmlns:a="http://schemas.openxmlformats.org/drawingml/2006/main" noChangeAspect="1"/>
             </wp:cNvGraphicFramePr>
@@ -15451,10 +15785,10 @@
           <w:noProof/>
         </w:rPr>
         <w:drawing>
-          <wp:inline distT="0" distB="0" distL="0" distR="0" wp14:anchorId="24E0040A" wp14:editId="4107AA41">
+          <wp:inline distT="0" distB="0" distL="0" distR="0" wp14:anchorId="10DA17EE" wp14:editId="19D4CF6B">
             <wp:extent cx="5715000" cy="2352675"/>
             <wp:effectExtent l="0" t="0" r="0" b="0"/>
-            <wp:docPr id="727258936" name="Imagen 727258936"/>
+            <wp:docPr id="130317328" name="Imagen 130317328"/>
             <wp:cNvGraphicFramePr>
               <a:graphicFrameLocks xmlns:a="http://schemas.openxmlformats.org/drawingml/2006/main" noChangeAspect="1"/>
             </wp:cNvGraphicFramePr>
@@ -15525,10 +15859,10 @@
           <w:noProof/>
         </w:rPr>
         <w:drawing>
-          <wp:inline distT="0" distB="0" distL="0" distR="0" wp14:anchorId="5E1B6969" wp14:editId="5CA7CD44">
+          <wp:inline distT="0" distB="0" distL="0" distR="0" wp14:anchorId="1425FA11" wp14:editId="0FF70883">
             <wp:extent cx="5715000" cy="1028700"/>
             <wp:effectExtent l="0" t="0" r="0" b="0"/>
-            <wp:docPr id="331636453" name="Imagen 331636453"/>
+            <wp:docPr id="933422869" name="Imagen 933422869"/>
             <wp:cNvGraphicFramePr>
               <a:graphicFrameLocks xmlns:a="http://schemas.openxmlformats.org/drawingml/2006/main" noChangeAspect="1"/>
             </wp:cNvGraphicFramePr>
@@ -15599,10 +15933,10 @@
           <w:noProof/>
         </w:rPr>
         <w:drawing>
-          <wp:inline distT="0" distB="0" distL="0" distR="0" wp14:anchorId="2C7A87AA" wp14:editId="73B3560D">
+          <wp:inline distT="0" distB="0" distL="0" distR="0" wp14:anchorId="130E551F" wp14:editId="27E43D56">
             <wp:extent cx="5715000" cy="1600200"/>
             <wp:effectExtent l="0" t="0" r="0" b="0"/>
-            <wp:docPr id="1966248674" name="Imagen 1966248674"/>
+            <wp:docPr id="1056378398" name="Imagen 1056378398"/>
             <wp:cNvGraphicFramePr>
               <a:graphicFrameLocks xmlns:a="http://schemas.openxmlformats.org/drawingml/2006/main" noChangeAspect="1"/>
             </wp:cNvGraphicFramePr>
@@ -15673,10 +16007,10 @@
           <w:noProof/>
         </w:rPr>
         <w:drawing>
-          <wp:inline distT="0" distB="0" distL="0" distR="0" wp14:anchorId="41F933FF" wp14:editId="104CA078">
+          <wp:inline distT="0" distB="0" distL="0" distR="0" wp14:anchorId="7A11D31F" wp14:editId="18DD4606">
             <wp:extent cx="5715000" cy="2171700"/>
             <wp:effectExtent l="0" t="0" r="0" b="0"/>
-            <wp:docPr id="809646722" name="Imagen 809646722"/>
+            <wp:docPr id="351670495" name="Imagen 351670495"/>
             <wp:cNvGraphicFramePr>
               <a:graphicFrameLocks xmlns:a="http://schemas.openxmlformats.org/drawingml/2006/main" noChangeAspect="1"/>
             </wp:cNvGraphicFramePr>
@@ -15747,10 +16081,10 @@
           <w:noProof/>
         </w:rPr>
         <w:drawing>
-          <wp:inline distT="0" distB="0" distL="0" distR="0" wp14:anchorId="66B4E579" wp14:editId="44D4308B">
+          <wp:inline distT="0" distB="0" distL="0" distR="0" wp14:anchorId="7BD40E19" wp14:editId="112DBE96">
             <wp:extent cx="5715000" cy="3581400"/>
             <wp:effectExtent l="0" t="0" r="0" b="0"/>
-            <wp:docPr id="1807302595" name="Imagen 1807302595"/>
+            <wp:docPr id="1542419209" name="Imagen 1542419209"/>
             <wp:cNvGraphicFramePr>
               <a:graphicFrameLocks xmlns:a="http://schemas.openxmlformats.org/drawingml/2006/main" noChangeAspect="1"/>
             </wp:cNvGraphicFramePr>
@@ -15821,10 +16155,10 @@
           <w:noProof/>
         </w:rPr>
         <w:drawing>
-          <wp:inline distT="0" distB="0" distL="0" distR="0" wp14:anchorId="1B571951" wp14:editId="77730393">
+          <wp:inline distT="0" distB="0" distL="0" distR="0" wp14:anchorId="22F52A61" wp14:editId="32679352">
             <wp:extent cx="5715000" cy="1695450"/>
             <wp:effectExtent l="0" t="0" r="0" b="0"/>
-            <wp:docPr id="1795914902" name="Imagen 1795914902"/>
+            <wp:docPr id="80407155" name="Imagen 80407155"/>
             <wp:cNvGraphicFramePr>
               <a:graphicFrameLocks xmlns:a="http://schemas.openxmlformats.org/drawingml/2006/main" noChangeAspect="1"/>
             </wp:cNvGraphicFramePr>
@@ -15895,10 +16229,10 @@
           <w:noProof/>
         </w:rPr>
         <w:drawing>
-          <wp:inline distT="0" distB="0" distL="0" distR="0" wp14:anchorId="125D25BA" wp14:editId="1A7D05D9">
+          <wp:inline distT="0" distB="0" distL="0" distR="0" wp14:anchorId="4A8B8096" wp14:editId="64D0E57D">
             <wp:extent cx="5715000" cy="1600200"/>
             <wp:effectExtent l="0" t="0" r="0" b="0"/>
-            <wp:docPr id="1421352065" name="Imagen 1421352065"/>
+            <wp:docPr id="1089747618" name="Imagen 1089747618"/>
             <wp:cNvGraphicFramePr>
               <a:graphicFrameLocks xmlns:a="http://schemas.openxmlformats.org/drawingml/2006/main" noChangeAspect="1"/>
             </wp:cNvGraphicFramePr>
@@ -15969,10 +16303,10 @@
           <w:noProof/>
         </w:rPr>
         <w:drawing>
-          <wp:inline distT="0" distB="0" distL="0" distR="0" wp14:anchorId="49560EED" wp14:editId="058783AD">
+          <wp:inline distT="0" distB="0" distL="0" distR="0" wp14:anchorId="3D00D4F0" wp14:editId="63F5BD92">
             <wp:extent cx="5715000" cy="2447925"/>
             <wp:effectExtent l="0" t="0" r="0" b="0"/>
-            <wp:docPr id="351231800" name="Imagen 351231800"/>
+            <wp:docPr id="396579179" name="Imagen 396579179"/>
             <wp:cNvGraphicFramePr>
               <a:graphicFrameLocks xmlns:a="http://schemas.openxmlformats.org/drawingml/2006/main" noChangeAspect="1"/>
             </wp:cNvGraphicFramePr>
@@ -16043,10 +16377,10 @@
           <w:noProof/>
         </w:rPr>
         <w:drawing>
-          <wp:inline distT="0" distB="0" distL="0" distR="0" wp14:anchorId="3AD334B4" wp14:editId="5399A15A">
+          <wp:inline distT="0" distB="0" distL="0" distR="0" wp14:anchorId="657687B1" wp14:editId="0F408298">
             <wp:extent cx="5715000" cy="2543175"/>
             <wp:effectExtent l="0" t="0" r="0" b="0"/>
-            <wp:docPr id="1014711796" name="Imagen 1014711796"/>
+            <wp:docPr id="983622375" name="Imagen 983622375"/>
             <wp:cNvGraphicFramePr>
               <a:graphicFrameLocks xmlns:a="http://schemas.openxmlformats.org/drawingml/2006/main" noChangeAspect="1"/>
             </wp:cNvGraphicFramePr>
@@ -16117,10 +16451,10 @@
           <w:noProof/>
         </w:rPr>
         <w:drawing>
-          <wp:inline distT="0" distB="0" distL="0" distR="0" wp14:anchorId="47CFC9DE" wp14:editId="09803121">
+          <wp:inline distT="0" distB="0" distL="0" distR="0" wp14:anchorId="38DECD46" wp14:editId="5675B7EA">
             <wp:extent cx="5715000" cy="1990725"/>
             <wp:effectExtent l="0" t="0" r="0" b="0"/>
-            <wp:docPr id="241914189" name="Imagen 241914189"/>
+            <wp:docPr id="587586079" name="Imagen 587586079"/>
             <wp:cNvGraphicFramePr>
               <a:graphicFrameLocks xmlns:a="http://schemas.openxmlformats.org/drawingml/2006/main" noChangeAspect="1"/>
             </wp:cNvGraphicFramePr>
@@ -16191,10 +16525,10 @@
           <w:noProof/>
         </w:rPr>
         <w:drawing>
-          <wp:inline distT="0" distB="0" distL="0" distR="0" wp14:anchorId="15E96C8C" wp14:editId="36F5FB1F">
+          <wp:inline distT="0" distB="0" distL="0" distR="0" wp14:anchorId="7D1D82C4" wp14:editId="702E9595">
             <wp:extent cx="5334000" cy="4581525"/>
             <wp:effectExtent l="0" t="0" r="0" b="0"/>
-            <wp:docPr id="1417834310" name="Imagen 1417834310"/>
+            <wp:docPr id="1680685515" name="Imagen 1680685515"/>
             <wp:cNvGraphicFramePr>
               <a:graphicFrameLocks xmlns:a="http://schemas.openxmlformats.org/drawingml/2006/main" noChangeAspect="1"/>
             </wp:cNvGraphicFramePr>
@@ -18944,7 +19278,7 @@
       <w:pPr>
         <w:pStyle w:val="Ttulo2"/>
       </w:pPr>
-      <w:bookmarkStart w:id="26" w:name="_Toc243371083"/>
+      <w:bookmarkStart w:id="26" w:name="_Toc243504134"/>
       <w:r>
         <w:t>7.3 Ejecución de la colección Postman en la nube</w:t>
       </w:r>
@@ -18970,10 +19304,10 @@
           <w:noProof/>
         </w:rPr>
         <w:drawing>
-          <wp:inline distT="0" distB="0" distL="0" distR="0" wp14:anchorId="15AF99F3" wp14:editId="0CB1AFE9">
+          <wp:inline distT="0" distB="0" distL="0" distR="0" wp14:anchorId="462D630C" wp14:editId="563DAF2E">
             <wp:extent cx="5334000" cy="4171950"/>
             <wp:effectExtent l="0" t="0" r="0" b="0"/>
-            <wp:docPr id="2022855288" name="Imagen 2022855288"/>
+            <wp:docPr id="547505558" name="Imagen 547505558"/>
             <wp:cNvGraphicFramePr>
               <a:graphicFrameLocks xmlns:a="http://schemas.openxmlformats.org/drawingml/2006/main" noChangeAspect="1"/>
             </wp:cNvGraphicFramePr>
@@ -19044,10 +19378,10 @@
           <w:noProof/>
         </w:rPr>
         <w:drawing>
-          <wp:inline distT="0" distB="0" distL="0" distR="0" wp14:anchorId="17B62CB4" wp14:editId="42DDAB90">
+          <wp:inline distT="0" distB="0" distL="0" distR="0" wp14:anchorId="1776602A" wp14:editId="3353E6AD">
             <wp:extent cx="5715000" cy="6438900"/>
             <wp:effectExtent l="0" t="0" r="0" b="0"/>
-            <wp:docPr id="1397758616" name="Imagen 1397758616"/>
+            <wp:docPr id="1531861322" name="Imagen 1531861322"/>
             <wp:cNvGraphicFramePr>
               <a:graphicFrameLocks xmlns:a="http://schemas.openxmlformats.org/drawingml/2006/main" noChangeAspect="1"/>
             </wp:cNvGraphicFramePr>
@@ -19118,10 +19452,10 @@
           <w:noProof/>
         </w:rPr>
         <w:drawing>
-          <wp:inline distT="0" distB="0" distL="0" distR="0" wp14:anchorId="4D0B99AA" wp14:editId="5112ED3E">
+          <wp:inline distT="0" distB="0" distL="0" distR="0" wp14:anchorId="34C55643" wp14:editId="118B12E6">
             <wp:extent cx="5715000" cy="6238875"/>
             <wp:effectExtent l="0" t="0" r="0" b="0"/>
-            <wp:docPr id="1978667832" name="Imagen 1978667832"/>
+            <wp:docPr id="1766307200" name="Imagen 1766307200"/>
             <wp:cNvGraphicFramePr>
               <a:graphicFrameLocks xmlns:a="http://schemas.openxmlformats.org/drawingml/2006/main" noChangeAspect="1"/>
             </wp:cNvGraphicFramePr>
@@ -19192,10 +19526,10 @@
           <w:noProof/>
         </w:rPr>
         <w:drawing>
-          <wp:inline distT="0" distB="0" distL="0" distR="0" wp14:anchorId="5E243F3C" wp14:editId="2F9AC73A">
+          <wp:inline distT="0" distB="0" distL="0" distR="0" wp14:anchorId="1F60AAC4" wp14:editId="5A83F74B">
             <wp:extent cx="5715000" cy="5248275"/>
             <wp:effectExtent l="0" t="0" r="0" b="0"/>
-            <wp:docPr id="602875704" name="Imagen 602875704"/>
+            <wp:docPr id="941220792" name="Imagen 941220792"/>
             <wp:cNvGraphicFramePr>
               <a:graphicFrameLocks xmlns:a="http://schemas.openxmlformats.org/drawingml/2006/main" noChangeAspect="1"/>
             </wp:cNvGraphicFramePr>
@@ -19259,11 +19593,674 @@
       <w:pPr>
         <w:pStyle w:val="Ttulo2"/>
       </w:pPr>
-      <w:bookmarkStart w:id="27" w:name="_Toc243371084"/>
-      <w:r>
-        <w:t>7.4 Pruebas de la capa de acceso a datos</w:t>
+      <w:bookmarkStart w:id="27" w:name="_Toc243504135"/>
+      <w:r>
+        <w:t>7.4 Interfaz web de la aplicación</w:t>
       </w:r>
       <w:bookmarkEnd w:id="27"/>
+    </w:p>
+    <w:p>
+      <w:pPr>
+        <w:spacing w:after="120"/>
+        <w:jc w:val="both"/>
+      </w:pPr>
+      <w:r>
+        <w:t>La interfaz web está publicada en la misma dirección: https://chd-rental-api.onrender.com. Permite usar el sistema sin herramientas técnicas y muestra el resultado de los servicios REST de forma visual. Las capturas se tomaron en la versión publicada en Render.</w:t>
+      </w:r>
+    </w:p>
+    <w:p>
+      <w:pPr>
+        <w:pStyle w:val="Prrafodelista"/>
+        <w:numPr>
+          <w:ilvl w:val="0"/>
+          <w:numId w:val="2"/>
+        </w:numPr>
+        <w:spacing w:after="60"/>
+        <w:jc w:val="both"/>
+      </w:pPr>
+      <w:r>
+        <w:rPr>
+          <w:b/>
+          <w:bCs/>
+        </w:rPr>
+        <w:t>Inicio de sesión:</w:t>
+      </w:r>
+      <w:r>
+        <w:t xml:space="preserve"> formulario conectado a POST /api/auth/login. Si el servidor gratuito está suspendido, muestra un aviso mientras se reactiva. Las cuentas de demostración no incluyen al administrador.</w:t>
+      </w:r>
+    </w:p>
+    <w:p>
+      <w:pPr>
+        <w:pStyle w:val="Prrafodelista"/>
+        <w:numPr>
+          <w:ilvl w:val="0"/>
+          <w:numId w:val="2"/>
+        </w:numPr>
+        <w:spacing w:after="60"/>
+        <w:jc w:val="both"/>
+      </w:pPr>
+      <w:r>
+        <w:rPr>
+          <w:b/>
+          <w:bCs/>
+        </w:rPr>
+        <w:t>Panel de inicio:</w:t>
+      </w:r>
+      <w:r>
+        <w:t xml:space="preserve"> indicadores de la flota (total, disponibles, alquilados y en mantenimiento), clientes, pagos confirmados, contratos activos y alertas de SOAT, revisión técnica y mantenimientos abiertos.</w:t>
+      </w:r>
+    </w:p>
+    <w:p>
+      <w:pPr>
+        <w:pStyle w:val="Prrafodelista"/>
+        <w:numPr>
+          <w:ilvl w:val="0"/>
+          <w:numId w:val="2"/>
+        </w:numPr>
+        <w:spacing w:after="60"/>
+        <w:jc w:val="both"/>
+      </w:pPr>
+      <w:r>
+        <w:rPr>
+          <w:b/>
+          <w:bCs/>
+        </w:rPr>
+        <w:t>Gestión:</w:t>
+      </w:r>
+      <w:r>
+        <w:t xml:space="preserve"> tablas con filtros y formularios para registrar, editar y eliminar clientes, vehículos, contratos, pagos, mantenimientos y usuarios (GET, POST, PUT y DELETE).</w:t>
+      </w:r>
+    </w:p>
+    <w:p>
+      <w:pPr>
+        <w:pStyle w:val="Prrafodelista"/>
+        <w:numPr>
+          <w:ilvl w:val="0"/>
+          <w:numId w:val="2"/>
+        </w:numPr>
+        <w:spacing w:after="60"/>
+        <w:jc w:val="both"/>
+      </w:pPr>
+      <w:r>
+        <w:rPr>
+          <w:b/>
+          <w:bCs/>
+        </w:rPr>
+        <w:t>Contratos:</w:t>
+      </w:r>
+      <w:r>
+        <w:t xml:space="preserve"> al llenar el formulario se muestra una vista previa de días, subtotal, IGV y total; el importe definitivo lo calcula el servidor.</w:t>
+      </w:r>
+    </w:p>
+    <w:p>
+      <w:pPr>
+        <w:pStyle w:val="Prrafodelista"/>
+        <w:numPr>
+          <w:ilvl w:val="0"/>
+          <w:numId w:val="2"/>
+        </w:numPr>
+        <w:spacing w:after="60"/>
+        <w:jc w:val="both"/>
+      </w:pPr>
+      <w:r>
+        <w:rPr>
+          <w:b/>
+          <w:bCs/>
+        </w:rPr>
+        <w:t>Roles:</w:t>
+      </w:r>
+      <w:r>
+        <w:t xml:space="preserve"> GERENCIA solo consulta, el botón Eliminar aparece solo para ADMIN y la pantalla de usuarios es exclusiva del administrador.</w:t>
+      </w:r>
+    </w:p>
+    <w:p>
+      <w:pPr>
+        <w:pStyle w:val="Prrafodelista"/>
+        <w:numPr>
+          <w:ilvl w:val="0"/>
+          <w:numId w:val="2"/>
+        </w:numPr>
+        <w:spacing w:after="60"/>
+        <w:jc w:val="both"/>
+      </w:pPr>
+      <w:r>
+        <w:rPr>
+          <w:b/>
+          <w:bCs/>
+        </w:rPr>
+        <w:t>Validaciones:</w:t>
+      </w:r>
+      <w:r>
+        <w:t xml:space="preserve"> los mensajes de error que devuelve la API se muestran junto al campo correspondiente. Incluye modo oscuro y diseño adaptable a celulares.</w:t>
+      </w:r>
+    </w:p>
+    <w:p>
+      <w:pPr>
+        <w:keepNext/>
+        <w:spacing w:before="120" w:after="60"/>
+        <w:jc w:val="center"/>
+      </w:pPr>
+      <w:r>
+        <w:rPr>
+          <w:noProof/>
+        </w:rPr>
+        <w:drawing>
+          <wp:inline distT="0" distB="0" distL="0" distR="0" wp14:anchorId="13B2ED23" wp14:editId="524018FA">
+            <wp:extent cx="5715000" cy="3209925"/>
+            <wp:effectExtent l="0" t="0" r="0" b="0"/>
+            <wp:docPr id="189018720" name="Imagen 189018720"/>
+            <wp:cNvGraphicFramePr>
+              <a:graphicFrameLocks xmlns:a="http://schemas.openxmlformats.org/drawingml/2006/main" noChangeAspect="1"/>
+            </wp:cNvGraphicFramePr>
+            <a:graphic xmlns:a="http://schemas.openxmlformats.org/drawingml/2006/main">
+              <a:graphicData uri="http://schemas.openxmlformats.org/drawingml/2006/picture">
+                <pic:pic xmlns:pic="http://schemas.openxmlformats.org/drawingml/2006/picture">
+                  <pic:nvPicPr>
+                    <pic:cNvPr id="0" name=""/>
+                    <pic:cNvPicPr>
+                      <a:picLocks noChangeAspect="1" noChangeArrowheads="1"/>
+                    </pic:cNvPicPr>
+                  </pic:nvPicPr>
+                  <pic:blipFill>
+                    <a:blip r:embed="rId35"/>
+                    <a:srcRect/>
+                    <a:stretch>
+                      <a:fillRect/>
+                    </a:stretch>
+                  </pic:blipFill>
+                  <pic:spPr bwMode="auto">
+                    <a:xfrm>
+                      <a:off x="0" y="0"/>
+                      <a:ext cx="5715000" cy="3209925"/>
+                    </a:xfrm>
+                    <a:prstGeom prst="rect">
+                      <a:avLst/>
+                    </a:prstGeom>
+                  </pic:spPr>
+                </pic:pic>
+              </a:graphicData>
+            </a:graphic>
+          </wp:inline>
+        </w:drawing>
+      </w:r>
+    </w:p>
+    <w:p>
+      <w:pPr>
+        <w:spacing w:after="200"/>
+        <w:jc w:val="center"/>
+      </w:pPr>
+      <w:r>
+        <w:rPr>
+          <w:b/>
+          <w:bCs/>
+          <w:sz w:val="18"/>
+          <w:szCs w:val="18"/>
+        </w:rPr>
+        <w:t xml:space="preserve">Figura 28. </w:t>
+      </w:r>
+      <w:r>
+        <w:rPr>
+          <w:i/>
+          <w:iCs/>
+          <w:sz w:val="18"/>
+          <w:szCs w:val="18"/>
+        </w:rPr>
+        <w:t>Interfaz web: inicio de sesión.</w:t>
+      </w:r>
+    </w:p>
+    <w:p>
+      <w:pPr>
+        <w:keepNext/>
+        <w:spacing w:before="120" w:after="60"/>
+        <w:jc w:val="center"/>
+      </w:pPr>
+      <w:r>
+        <w:rPr>
+          <w:noProof/>
+        </w:rPr>
+        <w:drawing>
+          <wp:inline distT="0" distB="0" distL="0" distR="0" wp14:anchorId="000B10AE" wp14:editId="438B9F3B">
+            <wp:extent cx="5715000" cy="3209925"/>
+            <wp:effectExtent l="0" t="0" r="0" b="0"/>
+            <wp:docPr id="2043512959" name="Imagen 2043512959"/>
+            <wp:cNvGraphicFramePr>
+              <a:graphicFrameLocks xmlns:a="http://schemas.openxmlformats.org/drawingml/2006/main" noChangeAspect="1"/>
+            </wp:cNvGraphicFramePr>
+            <a:graphic xmlns:a="http://schemas.openxmlformats.org/drawingml/2006/main">
+              <a:graphicData uri="http://schemas.openxmlformats.org/drawingml/2006/picture">
+                <pic:pic xmlns:pic="http://schemas.openxmlformats.org/drawingml/2006/picture">
+                  <pic:nvPicPr>
+                    <pic:cNvPr id="0" name=""/>
+                    <pic:cNvPicPr>
+                      <a:picLocks noChangeAspect="1" noChangeArrowheads="1"/>
+                    </pic:cNvPicPr>
+                  </pic:nvPicPr>
+                  <pic:blipFill>
+                    <a:blip r:embed="rId36"/>
+                    <a:srcRect/>
+                    <a:stretch>
+                      <a:fillRect/>
+                    </a:stretch>
+                  </pic:blipFill>
+                  <pic:spPr bwMode="auto">
+                    <a:xfrm>
+                      <a:off x="0" y="0"/>
+                      <a:ext cx="5715000" cy="3209925"/>
+                    </a:xfrm>
+                    <a:prstGeom prst="rect">
+                      <a:avLst/>
+                    </a:prstGeom>
+                  </pic:spPr>
+                </pic:pic>
+              </a:graphicData>
+            </a:graphic>
+          </wp:inline>
+        </w:drawing>
+      </w:r>
+    </w:p>
+    <w:p>
+      <w:pPr>
+        <w:spacing w:after="200"/>
+        <w:jc w:val="center"/>
+      </w:pPr>
+      <w:r>
+        <w:rPr>
+          <w:b/>
+          <w:bCs/>
+          <w:sz w:val="18"/>
+          <w:szCs w:val="18"/>
+        </w:rPr>
+        <w:t xml:space="preserve">Figura 29. </w:t>
+      </w:r>
+      <w:r>
+        <w:rPr>
+          <w:i/>
+          <w:iCs/>
+          <w:sz w:val="18"/>
+          <w:szCs w:val="18"/>
+        </w:rPr>
+        <w:t>Interfaz web: panel de inicio con indicadores y alertas de la flota.</w:t>
+      </w:r>
+    </w:p>
+    <w:p>
+      <w:pPr>
+        <w:keepNext/>
+        <w:spacing w:before="120" w:after="60"/>
+        <w:jc w:val="center"/>
+      </w:pPr>
+      <w:r>
+        <w:rPr>
+          <w:noProof/>
+        </w:rPr>
+        <w:drawing>
+          <wp:inline distT="0" distB="0" distL="0" distR="0" wp14:anchorId="5E6860DE" wp14:editId="6559023B">
+            <wp:extent cx="5715000" cy="3209925"/>
+            <wp:effectExtent l="0" t="0" r="0" b="0"/>
+            <wp:docPr id="525936986" name="Imagen 525936986"/>
+            <wp:cNvGraphicFramePr>
+              <a:graphicFrameLocks xmlns:a="http://schemas.openxmlformats.org/drawingml/2006/main" noChangeAspect="1"/>
+            </wp:cNvGraphicFramePr>
+            <a:graphic xmlns:a="http://schemas.openxmlformats.org/drawingml/2006/main">
+              <a:graphicData uri="http://schemas.openxmlformats.org/drawingml/2006/picture">
+                <pic:pic xmlns:pic="http://schemas.openxmlformats.org/drawingml/2006/picture">
+                  <pic:nvPicPr>
+                    <pic:cNvPr id="0" name=""/>
+                    <pic:cNvPicPr>
+                      <a:picLocks noChangeAspect="1" noChangeArrowheads="1"/>
+                    </pic:cNvPicPr>
+                  </pic:nvPicPr>
+                  <pic:blipFill>
+                    <a:blip r:embed="rId37"/>
+                    <a:srcRect/>
+                    <a:stretch>
+                      <a:fillRect/>
+                    </a:stretch>
+                  </pic:blipFill>
+                  <pic:spPr bwMode="auto">
+                    <a:xfrm>
+                      <a:off x="0" y="0"/>
+                      <a:ext cx="5715000" cy="3209925"/>
+                    </a:xfrm>
+                    <a:prstGeom prst="rect">
+                      <a:avLst/>
+                    </a:prstGeom>
+                  </pic:spPr>
+                </pic:pic>
+              </a:graphicData>
+            </a:graphic>
+          </wp:inline>
+        </w:drawing>
+      </w:r>
+    </w:p>
+    <w:p>
+      <w:pPr>
+        <w:spacing w:after="200"/>
+        <w:jc w:val="center"/>
+      </w:pPr>
+      <w:r>
+        <w:rPr>
+          <w:b/>
+          <w:bCs/>
+          <w:sz w:val="18"/>
+          <w:szCs w:val="18"/>
+        </w:rPr>
+        <w:t xml:space="preserve">Figura 30. </w:t>
+      </w:r>
+      <w:r>
+        <w:rPr>
+          <w:i/>
+          <w:iCs/>
+          <w:sz w:val="18"/>
+          <w:szCs w:val="18"/>
+        </w:rPr>
+        <w:t>Interfaz web: gestión de vehículos con estado y acciones.</w:t>
+      </w:r>
+    </w:p>
+    <w:p>
+      <w:pPr>
+        <w:keepNext/>
+        <w:spacing w:before="120" w:after="60"/>
+        <w:jc w:val="center"/>
+      </w:pPr>
+      <w:r>
+        <w:rPr>
+          <w:noProof/>
+        </w:rPr>
+        <w:drawing>
+          <wp:inline distT="0" distB="0" distL="0" distR="0" wp14:anchorId="22B78C9E" wp14:editId="769A548C">
+            <wp:extent cx="5715000" cy="3209925"/>
+            <wp:effectExtent l="0" t="0" r="0" b="0"/>
+            <wp:docPr id="769710328" name="Imagen 769710328"/>
+            <wp:cNvGraphicFramePr>
+              <a:graphicFrameLocks xmlns:a="http://schemas.openxmlformats.org/drawingml/2006/main" noChangeAspect="1"/>
+            </wp:cNvGraphicFramePr>
+            <a:graphic xmlns:a="http://schemas.openxmlformats.org/drawingml/2006/main">
+              <a:graphicData uri="http://schemas.openxmlformats.org/drawingml/2006/picture">
+                <pic:pic xmlns:pic="http://schemas.openxmlformats.org/drawingml/2006/picture">
+                  <pic:nvPicPr>
+                    <pic:cNvPr id="0" name=""/>
+                    <pic:cNvPicPr>
+                      <a:picLocks noChangeAspect="1" noChangeArrowheads="1"/>
+                    </pic:cNvPicPr>
+                  </pic:nvPicPr>
+                  <pic:blipFill>
+                    <a:blip r:embed="rId38"/>
+                    <a:srcRect/>
+                    <a:stretch>
+                      <a:fillRect/>
+                    </a:stretch>
+                  </pic:blipFill>
+                  <pic:spPr bwMode="auto">
+                    <a:xfrm>
+                      <a:off x="0" y="0"/>
+                      <a:ext cx="5715000" cy="3209925"/>
+                    </a:xfrm>
+                    <a:prstGeom prst="rect">
+                      <a:avLst/>
+                    </a:prstGeom>
+                  </pic:spPr>
+                </pic:pic>
+              </a:graphicData>
+            </a:graphic>
+          </wp:inline>
+        </w:drawing>
+      </w:r>
+    </w:p>
+    <w:p>
+      <w:pPr>
+        <w:spacing w:after="200"/>
+        <w:jc w:val="center"/>
+      </w:pPr>
+      <w:r>
+        <w:rPr>
+          <w:b/>
+          <w:bCs/>
+          <w:sz w:val="18"/>
+          <w:szCs w:val="18"/>
+        </w:rPr>
+        <w:t xml:space="preserve">Figura 31. </w:t>
+      </w:r>
+      <w:r>
+        <w:rPr>
+          <w:i/>
+          <w:iCs/>
+          <w:sz w:val="18"/>
+          <w:szCs w:val="18"/>
+        </w:rPr>
+        <w:t>Interfaz web: registro de contrato con vista previa del IGV y total.</w:t>
+      </w:r>
+    </w:p>
+    <w:p>
+      <w:pPr>
+        <w:keepNext/>
+        <w:spacing w:before="120" w:after="60"/>
+        <w:jc w:val="center"/>
+      </w:pPr>
+      <w:r>
+        <w:rPr>
+          <w:noProof/>
+        </w:rPr>
+        <w:drawing>
+          <wp:inline distT="0" distB="0" distL="0" distR="0" wp14:anchorId="19AA862F" wp14:editId="3DEA6E59">
+            <wp:extent cx="5715000" cy="3209925"/>
+            <wp:effectExtent l="0" t="0" r="0" b="0"/>
+            <wp:docPr id="2078399598" name="Imagen 2078399598"/>
+            <wp:cNvGraphicFramePr>
+              <a:graphicFrameLocks xmlns:a="http://schemas.openxmlformats.org/drawingml/2006/main" noChangeAspect="1"/>
+            </wp:cNvGraphicFramePr>
+            <a:graphic xmlns:a="http://schemas.openxmlformats.org/drawingml/2006/main">
+              <a:graphicData uri="http://schemas.openxmlformats.org/drawingml/2006/picture">
+                <pic:pic xmlns:pic="http://schemas.openxmlformats.org/drawingml/2006/picture">
+                  <pic:nvPicPr>
+                    <pic:cNvPr id="0" name=""/>
+                    <pic:cNvPicPr>
+                      <a:picLocks noChangeAspect="1" noChangeArrowheads="1"/>
+                    </pic:cNvPicPr>
+                  </pic:nvPicPr>
+                  <pic:blipFill>
+                    <a:blip r:embed="rId39"/>
+                    <a:srcRect/>
+                    <a:stretch>
+                      <a:fillRect/>
+                    </a:stretch>
+                  </pic:blipFill>
+                  <pic:spPr bwMode="auto">
+                    <a:xfrm>
+                      <a:off x="0" y="0"/>
+                      <a:ext cx="5715000" cy="3209925"/>
+                    </a:xfrm>
+                    <a:prstGeom prst="rect">
+                      <a:avLst/>
+                    </a:prstGeom>
+                  </pic:spPr>
+                </pic:pic>
+              </a:graphicData>
+            </a:graphic>
+          </wp:inline>
+        </w:drawing>
+      </w:r>
+    </w:p>
+    <w:p>
+      <w:pPr>
+        <w:spacing w:after="200"/>
+        <w:jc w:val="center"/>
+      </w:pPr>
+      <w:r>
+        <w:rPr>
+          <w:b/>
+          <w:bCs/>
+          <w:sz w:val="18"/>
+          <w:szCs w:val="18"/>
+        </w:rPr>
+        <w:t xml:space="preserve">Figura 32. </w:t>
+      </w:r>
+      <w:r>
+        <w:rPr>
+          <w:i/>
+          <w:iCs/>
+          <w:sz w:val="18"/>
+          <w:szCs w:val="18"/>
+        </w:rPr>
+        <w:t>Interfaz web: validación de datos devuelta por la API (RUC inválido).</w:t>
+      </w:r>
+    </w:p>
+    <w:p>
+      <w:pPr>
+        <w:keepNext/>
+        <w:spacing w:before="120" w:after="60"/>
+        <w:jc w:val="center"/>
+      </w:pPr>
+      <w:r>
+        <w:rPr>
+          <w:noProof/>
+        </w:rPr>
+        <w:drawing>
+          <wp:inline distT="0" distB="0" distL="0" distR="0" wp14:anchorId="65982BCA" wp14:editId="19D4CDF6">
+            <wp:extent cx="5715000" cy="3209925"/>
+            <wp:effectExtent l="0" t="0" r="0" b="0"/>
+            <wp:docPr id="176317872" name="Imagen 176317872"/>
+            <wp:cNvGraphicFramePr>
+              <a:graphicFrameLocks xmlns:a="http://schemas.openxmlformats.org/drawingml/2006/main" noChangeAspect="1"/>
+            </wp:cNvGraphicFramePr>
+            <a:graphic xmlns:a="http://schemas.openxmlformats.org/drawingml/2006/main">
+              <a:graphicData uri="http://schemas.openxmlformats.org/drawingml/2006/picture">
+                <pic:pic xmlns:pic="http://schemas.openxmlformats.org/drawingml/2006/picture">
+                  <pic:nvPicPr>
+                    <pic:cNvPr id="0" name=""/>
+                    <pic:cNvPicPr>
+                      <a:picLocks noChangeAspect="1" noChangeArrowheads="1"/>
+                    </pic:cNvPicPr>
+                  </pic:nvPicPr>
+                  <pic:blipFill>
+                    <a:blip r:embed="rId40"/>
+                    <a:srcRect/>
+                    <a:stretch>
+                      <a:fillRect/>
+                    </a:stretch>
+                  </pic:blipFill>
+                  <pic:spPr bwMode="auto">
+                    <a:xfrm>
+                      <a:off x="0" y="0"/>
+                      <a:ext cx="5715000" cy="3209925"/>
+                    </a:xfrm>
+                    <a:prstGeom prst="rect">
+                      <a:avLst/>
+                    </a:prstGeom>
+                  </pic:spPr>
+                </pic:pic>
+              </a:graphicData>
+            </a:graphic>
+          </wp:inline>
+        </w:drawing>
+      </w:r>
+    </w:p>
+    <w:p>
+      <w:pPr>
+        <w:spacing w:after="200"/>
+        <w:jc w:val="center"/>
+      </w:pPr>
+      <w:r>
+        <w:rPr>
+          <w:b/>
+          <w:bCs/>
+          <w:sz w:val="18"/>
+          <w:szCs w:val="18"/>
+        </w:rPr>
+        <w:t xml:space="preserve">Figura 33. </w:t>
+      </w:r>
+      <w:r>
+        <w:rPr>
+          <w:i/>
+          <w:iCs/>
+          <w:sz w:val="18"/>
+          <w:szCs w:val="18"/>
+        </w:rPr>
+        <w:t>Interfaz web con el rol GERENCIA: solo lectura, sin botones de registro ni eliminación.</w:t>
+      </w:r>
+    </w:p>
+    <w:p>
+      <w:pPr>
+        <w:keepNext/>
+        <w:spacing w:before="120" w:after="60"/>
+        <w:jc w:val="center"/>
+      </w:pPr>
+      <w:r>
+        <w:rPr>
+          <w:noProof/>
+        </w:rPr>
+        <w:drawing>
+          <wp:inline distT="0" distB="0" distL="0" distR="0" wp14:anchorId="13EE0739" wp14:editId="2D97D9AB">
+            <wp:extent cx="5715000" cy="3209925"/>
+            <wp:effectExtent l="0" t="0" r="0" b="0"/>
+            <wp:docPr id="1087276777" name="Imagen 1087276777"/>
+            <wp:cNvGraphicFramePr>
+              <a:graphicFrameLocks xmlns:a="http://schemas.openxmlformats.org/drawingml/2006/main" noChangeAspect="1"/>
+            </wp:cNvGraphicFramePr>
+            <a:graphic xmlns:a="http://schemas.openxmlformats.org/drawingml/2006/main">
+              <a:graphicData uri="http://schemas.openxmlformats.org/drawingml/2006/picture">
+                <pic:pic xmlns:pic="http://schemas.openxmlformats.org/drawingml/2006/picture">
+                  <pic:nvPicPr>
+                    <pic:cNvPr id="0" name=""/>
+                    <pic:cNvPicPr>
+                      <a:picLocks noChangeAspect="1" noChangeArrowheads="1"/>
+                    </pic:cNvPicPr>
+                  </pic:nvPicPr>
+                  <pic:blipFill>
+                    <a:blip r:embed="rId41"/>
+                    <a:srcRect/>
+                    <a:stretch>
+                      <a:fillRect/>
+                    </a:stretch>
+                  </pic:blipFill>
+                  <pic:spPr bwMode="auto">
+                    <a:xfrm>
+                      <a:off x="0" y="0"/>
+                      <a:ext cx="5715000" cy="3209925"/>
+                    </a:xfrm>
+                    <a:prstGeom prst="rect">
+                      <a:avLst/>
+                    </a:prstGeom>
+                  </pic:spPr>
+                </pic:pic>
+              </a:graphicData>
+            </a:graphic>
+          </wp:inline>
+        </w:drawing>
+      </w:r>
+    </w:p>
+    <w:p>
+      <w:pPr>
+        <w:spacing w:after="200"/>
+        <w:jc w:val="center"/>
+      </w:pPr>
+      <w:r>
+        <w:rPr>
+          <w:b/>
+          <w:bCs/>
+          <w:sz w:val="18"/>
+          <w:szCs w:val="18"/>
+        </w:rPr>
+        <w:t xml:space="preserve">Figura 34. </w:t>
+      </w:r>
+      <w:r>
+        <w:rPr>
+          <w:i/>
+          <w:iCs/>
+          <w:sz w:val="18"/>
+          <w:szCs w:val="18"/>
+        </w:rPr>
+        <w:t>Interfaz web en modo oscuro.</w:t>
+      </w:r>
+    </w:p>
+    <w:p>
+      <w:pPr>
+        <w:pStyle w:val="Ttulo2"/>
+      </w:pPr>
+      <w:bookmarkStart w:id="28" w:name="_Toc243504136"/>
+      <w:r>
+        <w:t>7.5 Pruebas de la capa de acceso a datos</w:t>
+      </w:r>
+      <w:bookmarkEnd w:id="28"/>
     </w:p>
     <w:p>
       <w:pPr>
@@ -20605,10 +21602,10 @@
           <w:noProof/>
         </w:rPr>
         <w:drawing>
-          <wp:inline distT="0" distB="0" distL="0" distR="0" wp14:anchorId="5FD9BB29" wp14:editId="3EEDEB7C">
+          <wp:inline distT="0" distB="0" distL="0" distR="0" wp14:anchorId="3586454C" wp14:editId="7B1D35B8">
             <wp:extent cx="5715000" cy="2466975"/>
             <wp:effectExtent l="0" t="0" r="0" b="0"/>
-            <wp:docPr id="649351572" name="Imagen 649351572"/>
+            <wp:docPr id="679371353" name="Imagen 679371353"/>
             <wp:cNvGraphicFramePr>
               <a:graphicFrameLocks xmlns:a="http://schemas.openxmlformats.org/drawingml/2006/main" noChangeAspect="1"/>
             </wp:cNvGraphicFramePr>
@@ -20622,7 +21619,7 @@
                     </pic:cNvPicPr>
                   </pic:nvPicPr>
                   <pic:blipFill>
-                    <a:blip r:embed="rId35"/>
+                    <a:blip r:embed="rId42"/>
                     <a:srcRect/>
                     <a:stretch>
                       <a:fillRect/>
@@ -20656,7 +21653,7 @@
           <w:sz w:val="18"/>
           <w:szCs w:val="18"/>
         </w:rPr>
-        <w:t xml:space="preserve">Figura 28. </w:t>
+        <w:t xml:space="preserve">Figura 35. </w:t>
       </w:r>
       <w:r>
         <w:rPr>
@@ -20672,11 +21669,11 @@
       <w:pPr>
         <w:pStyle w:val="Ttulo2"/>
       </w:pPr>
-      <w:bookmarkStart w:id="28" w:name="_Toc243371085"/>
-      <w:r>
-        <w:t>7.5 Video demo reel (3 a 5 minutos)</w:t>
-      </w:r>
-      <w:bookmarkEnd w:id="28"/>
+      <w:bookmarkStart w:id="29" w:name="_Toc243504137"/>
+      <w:r>
+        <w:t>7.6 Video demo reel (3 a 5 minutos)</w:t>
+      </w:r>
+      <w:bookmarkEnd w:id="29"/>
     </w:p>
     <w:p>
       <w:pPr>
@@ -21188,11 +22185,11 @@
       <w:pPr>
         <w:pStyle w:val="Ttulo2"/>
       </w:pPr>
-      <w:bookmarkStart w:id="29" w:name="_Toc243371086"/>
-      <w:r>
-        <w:t>7.6 Cronograma</w:t>
-      </w:r>
-      <w:bookmarkEnd w:id="29"/>
+      <w:bookmarkStart w:id="30" w:name="_Toc243504138"/>
+      <w:r>
+        <w:t>7.7 Cronograma</w:t>
+      </w:r>
+      <w:bookmarkEnd w:id="30"/>
     </w:p>
     <w:p>
       <w:pPr>
@@ -21893,11 +22890,11 @@
         <w:pStyle w:val="Ttulo1"/>
         <w:pageBreakBefore/>
       </w:pPr>
-      <w:bookmarkStart w:id="30" w:name="_Toc243371087"/>
+      <w:bookmarkStart w:id="31" w:name="_Toc243504139"/>
       <w:r>
         <w:t>8. CONCLUSIONES</w:t>
       </w:r>
-      <w:bookmarkEnd w:id="30"/>
+      <w:bookmarkEnd w:id="31"/>
     </w:p>
     <w:p>
       <w:pPr>
@@ -21945,11 +22942,11 @@
       <w:pPr>
         <w:pStyle w:val="Ttulo1"/>
       </w:pPr>
-      <w:bookmarkStart w:id="31" w:name="_Toc243371088"/>
+      <w:bookmarkStart w:id="32" w:name="_Toc243504140"/>
       <w:r>
         <w:t>9. RECOMENDACIONES</w:t>
       </w:r>
-      <w:bookmarkEnd w:id="31"/>
+      <w:bookmarkEnd w:id="32"/>
     </w:p>
     <w:p>
       <w:pPr>
@@ -21990,7 +22987,7 @@
         <w:jc w:val="both"/>
       </w:pPr>
       <w:r>
-        <w:t>Para una siguiente etapa, consumir estos servicios desde un front-end web o móvil, agregar paginación y renovación de tokens (refresh token), y conectar alertas de vencimiento de SOAT y revisión técnica, aprovechando que la lógica ya está expuesta como API.</w:t>
+        <w:t>Para una siguiente etapa, consumir estos mismos servicios desde una aplicación móvil para los conductores, agregar paginación y renovación de tokens (refresh token), y enviar por correo las alertas de vencimiento de SOAT y revisión técnica que ya muestra la interfaz web.</w:t>
       </w:r>
     </w:p>
     <w:p>
@@ -21998,11 +22995,11 @@
         <w:pStyle w:val="Ttulo1"/>
         <w:pageBreakBefore/>
       </w:pPr>
-      <w:bookmarkStart w:id="32" w:name="_Toc243371089"/>
+      <w:bookmarkStart w:id="33" w:name="_Toc243504141"/>
       <w:r>
         <w:t>10. GLOSARIO</w:t>
       </w:r>
-      <w:bookmarkEnd w:id="32"/>
+      <w:bookmarkEnd w:id="33"/>
     </w:p>
     <w:tbl>
       <w:tblPr>
@@ -23364,11 +24361,11 @@
         <w:pStyle w:val="Ttulo1"/>
         <w:pageBreakBefore/>
       </w:pPr>
-      <w:bookmarkStart w:id="33" w:name="_Toc243371090"/>
+      <w:bookmarkStart w:id="34" w:name="_Toc243504142"/>
       <w:r>
         <w:t>11. BIBLIOGRAFÍA</w:t>
       </w:r>
-      <w:bookmarkEnd w:id="33"/>
+      <w:bookmarkEnd w:id="34"/>
     </w:p>
     <w:p>
       <w:pPr>
@@ -23519,21 +24516,21 @@
         <w:pStyle w:val="Ttulo1"/>
         <w:pageBreakBefore/>
       </w:pPr>
-      <w:bookmarkStart w:id="34" w:name="_Toc243371091"/>
+      <w:bookmarkStart w:id="35" w:name="_Toc243504143"/>
       <w:r>
         <w:t>12. ANEXOS</w:t>
       </w:r>
-      <w:bookmarkEnd w:id="34"/>
+      <w:bookmarkEnd w:id="35"/>
     </w:p>
     <w:p>
       <w:pPr>
         <w:pStyle w:val="Ttulo2"/>
       </w:pPr>
-      <w:bookmarkStart w:id="35" w:name="_Toc243371092"/>
+      <w:bookmarkStart w:id="36" w:name="_Toc243504144"/>
       <w:r>
         <w:t>Anexo A. Estructura del código fuente</w:t>
       </w:r>
-      <w:bookmarkEnd w:id="35"/>
+      <w:bookmarkEnd w:id="36"/>
     </w:p>
     <w:p>
       <w:pPr>
@@ -23753,7 +24750,7 @@
           <w:sz w:val="16"/>
           <w:szCs w:val="16"/>
         </w:rPr>
-        <w:t xml:space="preserve">    ├── main/resources/  application.properties, application-h2.properties, static/index.html</w:t>
+        <w:t xml:space="preserve">    ├── main/resources/  application.properties, application-h2.properties</w:t>
       </w:r>
     </w:p>
     <w:p>
@@ -23766,35 +24763,7 @@
           <w:sz w:val="16"/>
           <w:szCs w:val="16"/>
         </w:rPr>
-        <w:t xml:space="preserve">    └── test/java/com/chd/rental/  repository/ (6), controller/ (2), service/ (1)</w:t>
-      </w:r>
-    </w:p>
-    <w:p>
-      <w:pPr>
-        <w:spacing w:after="60"/>
-      </w:pPr>
-    </w:p>
-    <w:p>
-      <w:pPr>
-        <w:pStyle w:val="Ttulo2"/>
-      </w:pPr>
-      <w:bookmarkStart w:id="36" w:name="_Toc243371093"/>
-      <w:r>
-        <w:t>Anexo B. Fragmentos de código clave</w:t>
-      </w:r>
-      <w:bookmarkEnd w:id="36"/>
-    </w:p>
-    <w:p>
-      <w:pPr>
-        <w:spacing w:after="120"/>
-        <w:jc w:val="both"/>
-      </w:pPr>
-      <w:r>
-        <w:rPr>
-          <w:b/>
-          <w:bCs/>
-        </w:rPr>
-        <w:t>B.1 Cifrado con BCrypt y reglas de acceso (SecurityConfig.java)</w:t>
+        <w:t xml:space="preserve">    │   └── static/      index.html, css/app.css, js/app.js, img/ (interfaz web)</w:t>
       </w:r>
     </w:p>
     <w:p>
@@ -23807,7 +24776,35 @@
           <w:sz w:val="16"/>
           <w:szCs w:val="16"/>
         </w:rPr>
-        <w:t>@Bean</w:t>
+        <w:t xml:space="preserve">    └── test/java/com/chd/rental/  repository/ (6), controller/ (2), service/ (1)</w:t>
+      </w:r>
+    </w:p>
+    <w:p>
+      <w:pPr>
+        <w:spacing w:after="60"/>
+      </w:pPr>
+    </w:p>
+    <w:p>
+      <w:pPr>
+        <w:pStyle w:val="Ttulo2"/>
+      </w:pPr>
+      <w:bookmarkStart w:id="37" w:name="_Toc243504145"/>
+      <w:r>
+        <w:t>Anexo B. Fragmentos de código clave</w:t>
+      </w:r>
+      <w:bookmarkEnd w:id="37"/>
+    </w:p>
+    <w:p>
+      <w:pPr>
+        <w:spacing w:after="120"/>
+        <w:jc w:val="both"/>
+      </w:pPr>
+      <w:r>
+        <w:rPr>
+          <w:b/>
+          <w:bCs/>
+        </w:rPr>
+        <w:t>B.1 Cifrado con BCrypt y reglas de acceso (SecurityConfig.java)</w:t>
       </w:r>
     </w:p>
     <w:p>
@@ -23820,7 +24817,7 @@
           <w:sz w:val="16"/>
           <w:szCs w:val="16"/>
         </w:rPr>
-        <w:t>public PasswordEncoder passwordEncoder() {</w:t>
+        <w:t>@Bean</w:t>
       </w:r>
     </w:p>
     <w:p>
@@ -23833,7 +24830,7 @@
           <w:sz w:val="16"/>
           <w:szCs w:val="16"/>
         </w:rPr>
-        <w:t xml:space="preserve">    return new BCryptPasswordEncoder();</w:t>
+        <w:t>public PasswordEncoder passwordEncoder() {</w:t>
       </w:r>
     </w:p>
     <w:p>
@@ -23846,7 +24843,7 @@
           <w:sz w:val="16"/>
           <w:szCs w:val="16"/>
         </w:rPr>
-        <w:t>}</w:t>
+        <w:t xml:space="preserve">    return new BCryptPasswordEncoder();</w:t>
       </w:r>
     </w:p>
     <w:p>
@@ -23859,7 +24856,7 @@
           <w:sz w:val="16"/>
           <w:szCs w:val="16"/>
         </w:rPr>
-        <w:t>...</w:t>
+        <w:t>}</w:t>
       </w:r>
     </w:p>
     <w:p>
@@ -23872,7 +24869,7 @@
           <w:sz w:val="16"/>
           <w:szCs w:val="16"/>
         </w:rPr>
-        <w:t>.authorizeHttpRequests(auth -&gt; auth</w:t>
+        <w:t>...</w:t>
       </w:r>
     </w:p>
     <w:p>
@@ -23885,7 +24882,7 @@
           <w:sz w:val="16"/>
           <w:szCs w:val="16"/>
         </w:rPr>
-        <w:t xml:space="preserve">        .requestMatchers(RUTAS_PUBLICAS).permitAll()</w:t>
+        <w:t>.authorizeHttpRequests(auth -&gt; auth</w:t>
       </w:r>
     </w:p>
     <w:p>
@@ -23898,7 +24895,7 @@
           <w:sz w:val="16"/>
           <w:szCs w:val="16"/>
         </w:rPr>
-        <w:t xml:space="preserve">        .requestMatchers("/api/usuarios/**").hasRole("ADMIN")</w:t>
+        <w:t xml:space="preserve">        .requestMatchers(RUTAS_PUBLICAS).permitAll()</w:t>
       </w:r>
     </w:p>
     <w:p>
@@ -23911,7 +24908,7 @@
           <w:sz w:val="16"/>
           <w:szCs w:val="16"/>
         </w:rPr>
-        <w:t xml:space="preserve">        .requestMatchers(HttpMethod.DELETE, "/api/**").hasRole("ADMIN")</w:t>
+        <w:t xml:space="preserve">        .requestMatchers("/api/usuarios/**").hasRole("ADMIN")</w:t>
       </w:r>
     </w:p>
     <w:p>
@@ -23924,7 +24921,7 @@
           <w:sz w:val="16"/>
           <w:szCs w:val="16"/>
         </w:rPr>
-        <w:t xml:space="preserve">        .requestMatchers(HttpMethod.POST, "/api/**").hasAnyRole(ROLES_ESCRITURA)</w:t>
+        <w:t xml:space="preserve">        .requestMatchers(HttpMethod.DELETE, "/api/**").hasRole("ADMIN")</w:t>
       </w:r>
     </w:p>
     <w:p>
@@ -23937,7 +24934,7 @@
           <w:sz w:val="16"/>
           <w:szCs w:val="16"/>
         </w:rPr>
-        <w:t xml:space="preserve">        .requestMatchers(HttpMethod.PUT, "/api/**").hasAnyRole(ROLES_ESCRITURA)</w:t>
+        <w:t xml:space="preserve">        .requestMatchers(HttpMethod.POST, "/api/**").hasAnyRole(ROLES_ESCRITURA)</w:t>
       </w:r>
     </w:p>
     <w:p>
@@ -23950,7 +24947,7 @@
           <w:sz w:val="16"/>
           <w:szCs w:val="16"/>
         </w:rPr>
-        <w:t xml:space="preserve">        .anyRequest().authenticated())</w:t>
+        <w:t xml:space="preserve">        .requestMatchers(HttpMethod.PUT, "/api/**").hasAnyRole(ROLES_ESCRITURA)</w:t>
       </w:r>
     </w:p>
     <w:p>
@@ -23963,25 +24960,7 @@
           <w:sz w:val="16"/>
           <w:szCs w:val="16"/>
         </w:rPr>
-        <w:t>.addFilterBefore(jwtFilter, UsernamePasswordAuthenticationFilter.class);</w:t>
-      </w:r>
-    </w:p>
-    <w:p>
-      <w:pPr>
-        <w:spacing w:after="60"/>
-      </w:pPr>
-    </w:p>
-    <w:p>
-      <w:pPr>
-        <w:spacing w:after="120"/>
-        <w:jc w:val="both"/>
-      </w:pPr>
-      <w:r>
-        <w:rPr>
-          <w:b/>
-          <w:bCs/>
-        </w:rPr>
-        <w:t>B.2 Servicio de login (AuthServiceImpl.java)</w:t>
+        <w:t xml:space="preserve">        .anyRequest().authenticated())</w:t>
       </w:r>
     </w:p>
     <w:p>
@@ -23994,7 +24973,25 @@
           <w:sz w:val="16"/>
           <w:szCs w:val="16"/>
         </w:rPr>
-        <w:t>public LoginResponse login(LoginRequest request) {</w:t>
+        <w:t>.addFilterBefore(jwtFilter, UsernamePasswordAuthenticationFilter.class);</w:t>
+      </w:r>
+    </w:p>
+    <w:p>
+      <w:pPr>
+        <w:spacing w:after="60"/>
+      </w:pPr>
+    </w:p>
+    <w:p>
+      <w:pPr>
+        <w:spacing w:after="120"/>
+        <w:jc w:val="both"/>
+      </w:pPr>
+      <w:r>
+        <w:rPr>
+          <w:b/>
+          <w:bCs/>
+        </w:rPr>
+        <w:t>B.2 Servicio de login (AuthServiceImpl.java)</w:t>
       </w:r>
     </w:p>
     <w:p>
@@ -24007,7 +25004,7 @@
           <w:sz w:val="16"/>
           <w:szCs w:val="16"/>
         </w:rPr>
-        <w:t xml:space="preserve">    String email = request.getEmail().trim().toLowerCase();</w:t>
+        <w:t>public LoginResponse login(LoginRequest request) {</w:t>
       </w:r>
     </w:p>
     <w:p>
@@ -24020,7 +25017,7 @@
           <w:sz w:val="16"/>
           <w:szCs w:val="16"/>
         </w:rPr>
-        <w:t xml:space="preserve">    // compara la clave con el hash BCrypt de la BD; lanza 401 si no coincide</w:t>
+        <w:t xml:space="preserve">    String email = request.getEmail().trim().toLowerCase();</w:t>
       </w:r>
     </w:p>
     <w:p>
@@ -24033,7 +25030,7 @@
           <w:sz w:val="16"/>
           <w:szCs w:val="16"/>
         </w:rPr>
-        <w:t xml:space="preserve">    authenticationManager.authenticate(</w:t>
+        <w:t xml:space="preserve">    // compara la clave con el hash BCrypt de la BD; lanza 401 si no coincide</w:t>
       </w:r>
     </w:p>
     <w:p>
@@ -24046,7 +25043,7 @@
           <w:sz w:val="16"/>
           <w:szCs w:val="16"/>
         </w:rPr>
-        <w:t xml:space="preserve">            new UsernamePasswordAuthenticationToken(email, request.getPassword()));</w:t>
+        <w:t xml:space="preserve">    authenticationManager.authenticate(</w:t>
       </w:r>
     </w:p>
     <w:p>
@@ -24059,7 +25056,7 @@
           <w:sz w:val="16"/>
           <w:szCs w:val="16"/>
         </w:rPr>
-        <w:t xml:space="preserve">    Usuario usuario = usuarioRepository.findByEmailIgnoreCase(email).orElseThrow();</w:t>
+        <w:t xml:space="preserve">            new UsernamePasswordAuthenticationToken(email, request.getPassword()));</w:t>
       </w:r>
     </w:p>
     <w:p>
@@ -24072,7 +25069,7 @@
           <w:sz w:val="16"/>
           <w:szCs w:val="16"/>
         </w:rPr>
-        <w:t xml:space="preserve">    usuario.setUltimaConexion(LocalDateTime.now());</w:t>
+        <w:t xml:space="preserve">    Usuario usuario = usuarioRepository.findByEmailIgnoreCase(email).orElseThrow();</w:t>
       </w:r>
     </w:p>
     <w:p>
@@ -24085,7 +25082,7 @@
           <w:sz w:val="16"/>
           <w:szCs w:val="16"/>
         </w:rPr>
-        <w:t xml:space="preserve">    String token = jwtService.generarToken(usuario.getEmail(), Map.of(</w:t>
+        <w:t xml:space="preserve">    usuario.setUltimaConexion(LocalDateTime.now());</w:t>
       </w:r>
     </w:p>
     <w:p>
@@ -24098,7 +25095,7 @@
           <w:sz w:val="16"/>
           <w:szCs w:val="16"/>
         </w:rPr>
-        <w:t xml:space="preserve">            "id", usuario.getId(), "nombre", usuario.getNombreCompleto(), "rol", usuario.getRol().name()));</w:t>
+        <w:t xml:space="preserve">    String token = jwtService.generarToken(usuario.getEmail(), Map.of(</w:t>
       </w:r>
     </w:p>
     <w:p>
@@ -24111,7 +25108,7 @@
           <w:sz w:val="16"/>
           <w:szCs w:val="16"/>
         </w:rPr>
-        <w:t xml:space="preserve">    return LoginResponse.builder().token(token)</w:t>
+        <w:t xml:space="preserve">            "id", usuario.getId(), "nombre", usuario.getNombreCompleto(), "rol", usuario.getRol().name()));</w:t>
       </w:r>
     </w:p>
     <w:p>
@@ -24124,7 +25121,7 @@
           <w:sz w:val="16"/>
           <w:szCs w:val="16"/>
         </w:rPr>
-        <w:t xml:space="preserve">            .expiraEn(jwtService.getExpiracionSegundos())</w:t>
+        <w:t xml:space="preserve">    return LoginResponse.builder().token(token)</w:t>
       </w:r>
     </w:p>
     <w:p>
@@ -24137,7 +25134,7 @@
           <w:sz w:val="16"/>
           <w:szCs w:val="16"/>
         </w:rPr>
-        <w:t xml:space="preserve">            .usuario(UsuarioResponse.from(usuario)).build();</w:t>
+        <w:t xml:space="preserve">            .expiraEn(jwtService.getExpiracionSegundos())</w:t>
       </w:r>
     </w:p>
     <w:p>
@@ -24150,25 +25147,7 @@
           <w:sz w:val="16"/>
           <w:szCs w:val="16"/>
         </w:rPr>
-        <w:t>}</w:t>
-      </w:r>
-    </w:p>
-    <w:p>
-      <w:pPr>
-        <w:spacing w:after="60"/>
-      </w:pPr>
-    </w:p>
-    <w:p>
-      <w:pPr>
-        <w:spacing w:after="120"/>
-        <w:jc w:val="both"/>
-      </w:pPr>
-      <w:r>
-        <w:rPr>
-          <w:b/>
-          <w:bCs/>
-        </w:rPr>
-        <w:t>B.3 Entidad con Lombok y consulta de cruce de fechas (Spring Data JPA)</w:t>
+        <w:t xml:space="preserve">            .usuario(UsuarioResponse.from(usuario)).build();</w:t>
       </w:r>
     </w:p>
     <w:p>
@@ -24181,7 +25160,25 @@
           <w:sz w:val="16"/>
           <w:szCs w:val="16"/>
         </w:rPr>
-        <w:t>@Entity @Table(name = "vehiculos")</w:t>
+        <w:t>}</w:t>
+      </w:r>
+    </w:p>
+    <w:p>
+      <w:pPr>
+        <w:spacing w:after="60"/>
+      </w:pPr>
+    </w:p>
+    <w:p>
+      <w:pPr>
+        <w:spacing w:after="120"/>
+        <w:jc w:val="both"/>
+      </w:pPr>
+      <w:r>
+        <w:rPr>
+          <w:b/>
+          <w:bCs/>
+        </w:rPr>
+        <w:t>B.3 Entidad con Lombok y consulta de cruce de fechas (Spring Data JPA)</w:t>
       </w:r>
     </w:p>
     <w:p>
@@ -24194,7 +25191,7 @@
           <w:sz w:val="16"/>
           <w:szCs w:val="16"/>
         </w:rPr>
-        <w:t>@Getter @Setter @NoArgsConstructor @AllArgsConstructor @Builder</w:t>
+        <w:t>@Entity @Table(name = "vehiculos")</w:t>
       </w:r>
     </w:p>
     <w:p>
@@ -24207,7 +25204,7 @@
           <w:sz w:val="16"/>
           <w:szCs w:val="16"/>
         </w:rPr>
-        <w:t>public class Vehiculo { ... }</w:t>
+        <w:t>@Getter @Setter @NoArgsConstructor @AllArgsConstructor @Builder</w:t>
       </w:r>
     </w:p>
     <w:p>
@@ -24220,7 +25217,7 @@
           <w:sz w:val="16"/>
           <w:szCs w:val="16"/>
         </w:rPr>
-        <w:t xml:space="preserve"> </w:t>
+        <w:t>public class Vehiculo { ... }</w:t>
       </w:r>
     </w:p>
     <w:p>
@@ -24233,7 +25230,7 @@
           <w:sz w:val="16"/>
           <w:szCs w:val="16"/>
         </w:rPr>
-        <w:t>@Query("""</w:t>
+        <w:t xml:space="preserve"> </w:t>
       </w:r>
     </w:p>
     <w:p>
@@ -24246,7 +25243,7 @@
           <w:sz w:val="16"/>
           <w:szCs w:val="16"/>
         </w:rPr>
-        <w:t xml:space="preserve">    SELECT COUNT(c) FROM Contrato c</w:t>
+        <w:t>@Query("""</w:t>
       </w:r>
     </w:p>
     <w:p>
@@ -24259,7 +25256,7 @@
           <w:sz w:val="16"/>
           <w:szCs w:val="16"/>
         </w:rPr>
-        <w:t xml:space="preserve">    WHERE c.vehiculo.id = :idVehiculo</w:t>
+        <w:t xml:space="preserve">    SELECT COUNT(c) FROM Contrato c</w:t>
       </w:r>
     </w:p>
     <w:p>
@@ -24272,7 +25269,7 @@
           <w:sz w:val="16"/>
           <w:szCs w:val="16"/>
         </w:rPr>
-        <w:t xml:space="preserve">      AND c.estado IN (EstadoContrato.PENDIENTE, EstadoContrato.ACTIVO)</w:t>
+        <w:t xml:space="preserve">    WHERE c.vehiculo.id = :idVehiculo</w:t>
       </w:r>
     </w:p>
     <w:p>
@@ -24285,7 +25282,7 @@
           <w:sz w:val="16"/>
           <w:szCs w:val="16"/>
         </w:rPr>
-        <w:t xml:space="preserve">      AND c.fechaInicio &lt;= :fin AND c.fechaFin &gt;= :inicio</w:t>
+        <w:t xml:space="preserve">      AND c.estado IN (EstadoContrato.PENDIENTE, EstadoContrato.ACTIVO)</w:t>
       </w:r>
     </w:p>
     <w:p>
@@ -24298,7 +25295,7 @@
           <w:sz w:val="16"/>
           <w:szCs w:val="16"/>
         </w:rPr>
-        <w:t xml:space="preserve">      AND (:excluirId IS NULL OR c.id &lt;&gt; :excluirId)""")</w:t>
+        <w:t xml:space="preserve">      AND c.fechaInicio &lt;= :fin AND c.fechaFin &gt;= :inicio</w:t>
       </w:r>
     </w:p>
     <w:p>
@@ -24311,25 +25308,7 @@
           <w:sz w:val="16"/>
           <w:szCs w:val="16"/>
         </w:rPr>
-        <w:t>long contarCruces(Long idVehiculo, LocalDate inicio, LocalDate fin, Long excluirId);</w:t>
-      </w:r>
-    </w:p>
-    <w:p>
-      <w:pPr>
-        <w:spacing w:after="60"/>
-      </w:pPr>
-    </w:p>
-    <w:p>
-      <w:pPr>
-        <w:spacing w:after="120"/>
-        <w:jc w:val="both"/>
-      </w:pPr>
-      <w:r>
-        <w:rPr>
-          <w:b/>
-          <w:bCs/>
-        </w:rPr>
-        <w:t>B.4 Prueba de la capa de acceso a datos (ClienteRepositoryTest.java)</w:t>
+        <w:t xml:space="preserve">      AND (:excluirId IS NULL OR c.id &lt;&gt; :excluirId)""")</w:t>
       </w:r>
     </w:p>
     <w:p>
@@ -24342,7 +25321,25 @@
           <w:sz w:val="16"/>
           <w:szCs w:val="16"/>
         </w:rPr>
-        <w:t>@DataJpaTest</w:t>
+        <w:t>long contarCruces(Long idVehiculo, LocalDate inicio, LocalDate fin, Long excluirId);</w:t>
+      </w:r>
+    </w:p>
+    <w:p>
+      <w:pPr>
+        <w:spacing w:after="60"/>
+      </w:pPr>
+    </w:p>
+    <w:p>
+      <w:pPr>
+        <w:spacing w:after="120"/>
+        <w:jc w:val="both"/>
+      </w:pPr>
+      <w:r>
+        <w:rPr>
+          <w:b/>
+          <w:bCs/>
+        </w:rPr>
+        <w:t>B.4 Prueba de la capa de acceso a datos (ClienteRepositoryTest.java)</w:t>
       </w:r>
     </w:p>
     <w:p>
@@ -24355,7 +25352,7 @@
           <w:sz w:val="16"/>
           <w:szCs w:val="16"/>
         </w:rPr>
-        <w:t>class ClienteRepositoryTest {</w:t>
+        <w:t>@DataJpaTest</w:t>
       </w:r>
     </w:p>
     <w:p>
@@ -24368,7 +25365,7 @@
           <w:sz w:val="16"/>
           <w:szCs w:val="16"/>
         </w:rPr>
-        <w:t xml:space="preserve">    @Test void actualizar() {</w:t>
+        <w:t>class ClienteRepositoryTest {</w:t>
       </w:r>
     </w:p>
     <w:p>
@@ -24381,7 +25378,7 @@
           <w:sz w:val="16"/>
           <w:szCs w:val="16"/>
         </w:rPr>
-        <w:t xml:space="preserve">        Cliente c = repository.save(DatosPrueba.cliente("20333333333"));</w:t>
+        <w:t xml:space="preserve">    @Test void actualizar() {</w:t>
       </w:r>
     </w:p>
     <w:p>
@@ -24394,7 +25391,7 @@
           <w:sz w:val="16"/>
           <w:szCs w:val="16"/>
         </w:rPr>
-        <w:t xml:space="preserve">        em.flush(); em.clear();</w:t>
+        <w:t xml:space="preserve">        Cliente c = repository.save(DatosPrueba.cliente("20333333333"));</w:t>
       </w:r>
     </w:p>
     <w:p>
@@ -24407,7 +25404,7 @@
           <w:sz w:val="16"/>
           <w:szCs w:val="16"/>
         </w:rPr>
-        <w:t xml:space="preserve">        Cliente aEditar = repository.findById(c.getId()).orElseThrow();</w:t>
+        <w:t xml:space="preserve">        em.flush(); em.clear();</w:t>
       </w:r>
     </w:p>
     <w:p>
@@ -24420,7 +25417,7 @@
           <w:sz w:val="16"/>
           <w:szCs w:val="16"/>
         </w:rPr>
-        <w:t xml:space="preserve">        aEditar.setRazonSocial("Razon Social Actualizada");</w:t>
+        <w:t xml:space="preserve">        Cliente aEditar = repository.findById(c.getId()).orElseThrow();</w:t>
       </w:r>
     </w:p>
     <w:p>
@@ -24433,7 +25430,7 @@
           <w:sz w:val="16"/>
           <w:szCs w:val="16"/>
         </w:rPr>
-        <w:t xml:space="preserve">        repository.saveAndFlush(aEditar); em.clear();</w:t>
+        <w:t xml:space="preserve">        aEditar.setRazonSocial("Razon Social Actualizada");</w:t>
       </w:r>
     </w:p>
     <w:p>
@@ -24446,7 +25443,7 @@
           <w:sz w:val="16"/>
           <w:szCs w:val="16"/>
         </w:rPr>
-        <w:t xml:space="preserve">        assertThat(repository.findById(c.getId()).orElseThrow().getRazonSocial())</w:t>
+        <w:t xml:space="preserve">        repository.saveAndFlush(aEditar); em.clear();</w:t>
       </w:r>
     </w:p>
     <w:p>
@@ -24459,7 +25456,7 @@
           <w:sz w:val="16"/>
           <w:szCs w:val="16"/>
         </w:rPr>
-        <w:t xml:space="preserve">                .isEqualTo("Razon Social Actualizada");</w:t>
+        <w:t xml:space="preserve">        assertThat(repository.findById(c.getId()).orElseThrow().getRazonSocial())</w:t>
       </w:r>
     </w:p>
     <w:p>
@@ -24472,7 +25469,7 @@
           <w:sz w:val="16"/>
           <w:szCs w:val="16"/>
         </w:rPr>
-        <w:t xml:space="preserve">    }</w:t>
+        <w:t xml:space="preserve">                .isEqualTo("Razon Social Actualizada");</w:t>
       </w:r>
     </w:p>
     <w:p>
@@ -24485,6 +25482,19 @@
           <w:sz w:val="16"/>
           <w:szCs w:val="16"/>
         </w:rPr>
+        <w:t xml:space="preserve">    }</w:t>
+      </w:r>
+    </w:p>
+    <w:p>
+      <w:pPr>
+        <w:shd w:val="clear" w:color="auto" w:fill="F3F5F9"/>
+      </w:pPr>
+      <w:r>
+        <w:rPr>
+          <w:rFonts w:ascii="Consolas" w:eastAsia="Consolas" w:hAnsi="Consolas" w:cs="Consolas"/>
+          <w:sz w:val="16"/>
+          <w:szCs w:val="16"/>
+        </w:rPr>
         <w:t>}</w:t>
       </w:r>
     </w:p>
@@ -24497,11 +25507,11 @@
       <w:pPr>
         <w:pStyle w:val="Ttulo2"/>
       </w:pPr>
-      <w:bookmarkStart w:id="37" w:name="_Toc243371094"/>
+      <w:bookmarkStart w:id="38" w:name="_Toc243504146"/>
       <w:r>
         <w:t>Anexo C. Matriz de cumplimiento de la rúbrica</w:t>
       </w:r>
-      <w:bookmarkEnd w:id="37"/>
+      <w:bookmarkEnd w:id="38"/>
     </w:p>
     <w:tbl>
       <w:tblPr>
@@ -25383,7 +26393,7 @@
                 <w:sz w:val="19"/>
                 <w:szCs w:val="19"/>
               </w:rPr>
-              <w:t>Formato del informe</w:t>
+              <w:t>Interfaz web (adicional)</w:t>
             </w:r>
           </w:p>
         </w:tc>
@@ -25410,7 +26420,7 @@
                 <w:sz w:val="19"/>
                 <w:szCs w:val="19"/>
               </w:rPr>
-              <w:t>A4, márgenes 3/2,5 cm, Arial 11, interlineado simple, carátula según 6.3.</w:t>
+              <w:t>Login, panel y gestión publicados en Render (7.4).</w:t>
             </w:r>
           </w:p>
         </w:tc>
@@ -25473,6 +26483,97 @@
                 <w:sz w:val="19"/>
                 <w:szCs w:val="19"/>
               </w:rPr>
+              <w:t>Formato del informe</w:t>
+            </w:r>
+          </w:p>
+        </w:tc>
+        <w:tc>
+          <w:tcPr>
+            <w:tcW w:w="4571" w:type="dxa"/>
+            <w:tcBorders>
+              <w:top w:val="single" w:sz="4" w:space="0" w:color="A6B0C3"/>
+              <w:left w:val="single" w:sz="4" w:space="0" w:color="A6B0C3"/>
+              <w:bottom w:val="single" w:sz="4" w:space="0" w:color="A6B0C3"/>
+              <w:right w:val="single" w:sz="4" w:space="0" w:color="A6B0C3"/>
+            </w:tcBorders>
+            <w:shd w:val="clear" w:color="auto" w:fill="EEF2F8"/>
+            <w:tcMar>
+              <w:top w:w="50" w:type="dxa"/>
+              <w:left w:w="90" w:type="dxa"/>
+              <w:bottom w:w="50" w:type="dxa"/>
+              <w:right w:w="90" w:type="dxa"/>
+            </w:tcMar>
+            <w:vAlign w:val="center"/>
+          </w:tcPr>
+          <w:p>
+            <w:r>
+              <w:rPr>
+                <w:sz w:val="19"/>
+                <w:szCs w:val="19"/>
+              </w:rPr>
+              <w:t>A4, márgenes 3/2,5 cm, Arial 11, interlineado simple, carátula según 6.3.</w:t>
+            </w:r>
+          </w:p>
+        </w:tc>
+        <w:tc>
+          <w:tcPr>
+            <w:tcW w:w="1800" w:type="dxa"/>
+            <w:tcBorders>
+              <w:top w:val="single" w:sz="4" w:space="0" w:color="A6B0C3"/>
+              <w:left w:val="single" w:sz="4" w:space="0" w:color="A6B0C3"/>
+              <w:bottom w:val="single" w:sz="4" w:space="0" w:color="A6B0C3"/>
+              <w:right w:val="single" w:sz="4" w:space="0" w:color="A6B0C3"/>
+            </w:tcBorders>
+            <w:shd w:val="clear" w:color="auto" w:fill="EEF2F8"/>
+            <w:tcMar>
+              <w:top w:w="50" w:type="dxa"/>
+              <w:left w:w="90" w:type="dxa"/>
+              <w:bottom w:w="50" w:type="dxa"/>
+              <w:right w:w="90" w:type="dxa"/>
+            </w:tcMar>
+            <w:vAlign w:val="center"/>
+          </w:tcPr>
+          <w:p>
+            <w:r>
+              <w:rPr>
+                <w:sz w:val="19"/>
+                <w:szCs w:val="19"/>
+              </w:rPr>
+              <w:t>Cumple</w:t>
+            </w:r>
+          </w:p>
+        </w:tc>
+      </w:tr>
+      <w:tr>
+        <w:tblPrEx>
+          <w:tblCellMar>
+            <w:top w:w="0" w:type="dxa"/>
+            <w:bottom w:w="0" w:type="dxa"/>
+          </w:tblCellMar>
+        </w:tblPrEx>
+        <w:tc>
+          <w:tcPr>
+            <w:tcW w:w="2700" w:type="dxa"/>
+            <w:tcBorders>
+              <w:top w:val="single" w:sz="4" w:space="0" w:color="A6B0C3"/>
+              <w:left w:val="single" w:sz="4" w:space="0" w:color="A6B0C3"/>
+              <w:bottom w:val="single" w:sz="4" w:space="0" w:color="A6B0C3"/>
+              <w:right w:val="single" w:sz="4" w:space="0" w:color="A6B0C3"/>
+            </w:tcBorders>
+            <w:tcMar>
+              <w:top w:w="50" w:type="dxa"/>
+              <w:left w:w="90" w:type="dxa"/>
+              <w:bottom w:w="50" w:type="dxa"/>
+              <w:right w:w="90" w:type="dxa"/>
+            </w:tcMar>
+            <w:vAlign w:val="center"/>
+          </w:tcPr>
+          <w:p>
+            <w:r>
+              <w:rPr>
+                <w:sz w:val="19"/>
+                <w:szCs w:val="19"/>
+              </w:rPr>
               <w:t>Entrega (7.1)</w:t>
             </w:r>
           </w:p>
@@ -25486,7 +26587,6 @@
               <w:bottom w:val="single" w:sz="4" w:space="0" w:color="A6B0C3"/>
               <w:right w:val="single" w:sz="4" w:space="0" w:color="A6B0C3"/>
             </w:tcBorders>
-            <w:shd w:val="clear" w:color="auto" w:fill="EEF2F8"/>
             <w:tcMar>
               <w:top w:w="50" w:type="dxa"/>
               <w:left w:w="90" w:type="dxa"/>
@@ -25514,22 +26614,21 @@
               <w:bottom w:val="single" w:sz="4" w:space="0" w:color="A6B0C3"/>
               <w:right w:val="single" w:sz="4" w:space="0" w:color="A6B0C3"/>
             </w:tcBorders>
-            <w:shd w:val="clear" w:color="auto" w:fill="EEF2F8"/>
-            <w:tcMar>
-              <w:top w:w="50" w:type="dxa"/>
-              <w:left w:w="90" w:type="dxa"/>
-              <w:bottom w:w="50" w:type="dxa"/>
-              <w:right w:w="90" w:type="dxa"/>
-            </w:tcMar>
-            <w:vAlign w:val="center"/>
-          </w:tcPr>
-          <w:p>
-            <w:r>
-              <w:rPr>
-                <w:sz w:val="19"/>
-                <w:szCs w:val="19"/>
-              </w:rPr>
-              <w:t>Pendiente: PPT y video</w:t>
+            <w:tcMar>
+              <w:top w:w="50" w:type="dxa"/>
+              <w:left w:w="90" w:type="dxa"/>
+              <w:bottom w:w="50" w:type="dxa"/>
+              <w:right w:w="90" w:type="dxa"/>
+            </w:tcMar>
+            <w:vAlign w:val="center"/>
+          </w:tcPr>
+          <w:p>
+            <w:r>
+              <w:rPr>
+                <w:sz w:val="19"/>
+                <w:szCs w:val="19"/>
+              </w:rPr>
+              <w:t>Pendiente: video</w:t>
             </w:r>
           </w:p>
         </w:tc>
@@ -25539,11 +26638,11 @@
       <w:pPr>
         <w:pStyle w:val="Ttulo2"/>
       </w:pPr>
-      <w:bookmarkStart w:id="38" w:name="_Toc243371095"/>
+      <w:bookmarkStart w:id="39" w:name="_Toc243504147"/>
       <w:r>
         <w:t>Anexo D. Usuarios de prueba</w:t>
       </w:r>
-      <w:bookmarkEnd w:id="38"/>
+      <w:bookmarkEnd w:id="39"/>
     </w:p>
     <w:tbl>
       <w:tblPr>
@@ -26050,8 +27149,8 @@
       </w:r>
     </w:p>
     <w:sectPr>
-      <w:headerReference w:type="default" r:id="rId36"/>
-      <w:footerReference w:type="default" r:id="rId37"/>
+      <w:headerReference w:type="default" r:id="rId43"/>
+      <w:footerReference w:type="default" r:id="rId44"/>
       <w:pgSz w:w="11906" w:h="16838"/>
       <w:pgMar w:top="1701" w:right="1417" w:bottom="1701" w:left="1417" w:header="709" w:footer="709" w:gutter="0"/>
       <w:cols w:space="720"/>
@@ -26335,10 +27434,10 @@
 <file path=word/numbering.xml><?xml version="1.0" encoding="utf-8"?>
 <w:numbering xmlns:wpc="http://schemas.microsoft.com/office/word/2010/wordprocessingCanvas" xmlns:cx="http://schemas.microsoft.com/office/drawing/2014/chartex" xmlns:cx1="http://schemas.microsoft.com/office/drawing/2015/9/8/chartex" xmlns:cx2="http://schemas.microsoft.com/office/drawing/2015/10/21/chartex" xmlns:cx3="http://schemas.microsoft.com/office/drawing/2016/5/9/chartex" xmlns:cx4="http://schemas.microsoft.com/office/drawing/2016/5/10/chartex" xmlns:cx5="http://schemas.microsoft.com/office/drawing/2016/5/11/chartex" xmlns:cx6="http://schemas.microsoft.com/office/drawing/2016/5/12/chartex" xmlns:cx7="http://schemas.microsoft.com/office/drawing/2016/5/13/chartex" xmlns:cx8="http://schemas.microsoft.com/office/drawing/2016/5/14/chartex" xmlns:mc="http://schemas.openxmlformats.org/markup-compatibility/2006" xmlns:aink="http://schemas.microsoft.com/office/drawing/2016/ink" xmlns:am3d="http://schemas.microsoft.com/office/drawing/2017/model3d" xmlns:o="urn:schemas-microsoft-com:office:office" xmlns:oel="http://schemas.microsoft.com/office/2019/extlst" xmlns:r="http://schemas.openxmlformats.org/officeDocument/2006/relationships" xmlns:m="http://schemas.openxmlformats.org/officeDocument/2006/math" xmlns:v="urn:schemas-microsoft-com:vml" xmlns:wp14="http://schemas.microsoft.com/office/word/2010/wordprocessingDrawing" xmlns:wp="http://schemas.openxmlformats.org/drawingml/2006/wordprocessingDrawing" xmlns:w10="urn:schemas-microsoft-com:office:word" xmlns:w="http://schemas.openxmlformats.org/wordprocessingml/2006/main" xmlns:w14="http://schemas.microsoft.com/office/word/2010/wordml" xmlns:w15="http://schemas.microsoft.com/office/word/2012/wordml" xmlns:w16cex="http://schemas.microsoft.com/office/word/2018/wordml/cex" xmlns:w16cid="http://schemas.microsoft.com/office/word/2016/wordml/cid" xmlns:w16="http://schemas.microsoft.com/office/word/2018/wordml" xmlns:w16du="http://schemas.microsoft.com/office/word/2023/wordml/word16du" xmlns:w16sdtdh="http://schemas.microsoft.com/office/word/2020/wordml/sdtdatahash" xmlns:w16sdtfl="http://schemas.microsoft.com/office/word/2024/wordml/sdtformatlock" xmlns:w16se="http://schemas.microsoft.com/office/word/2015/wordml/symex" xmlns:wpg="http://schemas.microsoft.com/office/word/2010/wordprocessingGroup" xmlns:wpi="http://schemas.microsoft.com/office/word/2010/wordprocessingInk" xmlns:wne="http://schemas.microsoft.com/office/word/2006/wordml" xmlns:wps="http://schemas.microsoft.com/office/word/2010/wordprocessingShape" mc:Ignorable="w14 w15 w16se w16cid w16 w16cex w16sdtdh w16sdtfl w16du wp14">
   <w:abstractNum w:abstractNumId="0" w15:restartNumberingAfterBreak="0">
-    <w:nsid w:val="0E6A1D80"/>
+    <w:nsid w:val="0E0467AF"/>
     <w:multiLevelType w:val="hybridMultilevel"/>
-    <w:tmpl w:val="FD5C7F98"/>
-    <w:lvl w:ilvl="0" w:tplc="81C6ED02">
+    <w:tmpl w:val="013A7E02"/>
+    <w:lvl w:ilvl="0" w:tplc="8668AE60">
       <w:start w:val="1"/>
       <w:numFmt w:val="bullet"/>
       <w:lvlText w:val="•"/>
@@ -26347,7 +27446,7 @@
         <w:ind w:left="567" w:hanging="283"/>
       </w:pPr>
     </w:lvl>
-    <w:lvl w:ilvl="1" w:tplc="2312E984">
+    <w:lvl w:ilvl="1" w:tplc="0CDCCDC6">
       <w:start w:val="1"/>
       <w:numFmt w:val="bullet"/>
       <w:lvlText w:val="–"/>
@@ -26356,47 +27455,47 @@
         <w:ind w:left="1134" w:hanging="283"/>
       </w:pPr>
     </w:lvl>
-    <w:lvl w:ilvl="2" w:tplc="02AAB2C2">
+    <w:lvl w:ilvl="2" w:tplc="B9601D50">
       <w:numFmt w:val="decimal"/>
       <w:lvlText w:val=""/>
       <w:lvlJc w:val="left"/>
     </w:lvl>
-    <w:lvl w:ilvl="3" w:tplc="5B820C48">
+    <w:lvl w:ilvl="3" w:tplc="CC2C2EC4">
       <w:numFmt w:val="decimal"/>
       <w:lvlText w:val=""/>
       <w:lvlJc w:val="left"/>
     </w:lvl>
-    <w:lvl w:ilvl="4" w:tplc="9454D1D2">
+    <w:lvl w:ilvl="4" w:tplc="851AB668">
       <w:numFmt w:val="decimal"/>
       <w:lvlText w:val=""/>
       <w:lvlJc w:val="left"/>
     </w:lvl>
-    <w:lvl w:ilvl="5" w:tplc="08EA4B46">
+    <w:lvl w:ilvl="5" w:tplc="3982AA5C">
       <w:numFmt w:val="decimal"/>
       <w:lvlText w:val=""/>
       <w:lvlJc w:val="left"/>
     </w:lvl>
-    <w:lvl w:ilvl="6" w:tplc="2C24A8BA">
+    <w:lvl w:ilvl="6" w:tplc="33B03FC0">
       <w:numFmt w:val="decimal"/>
       <w:lvlText w:val=""/>
       <w:lvlJc w:val="left"/>
     </w:lvl>
-    <w:lvl w:ilvl="7" w:tplc="68BED438">
+    <w:lvl w:ilvl="7" w:tplc="FAA65CA6">
       <w:numFmt w:val="decimal"/>
       <w:lvlText w:val=""/>
       <w:lvlJc w:val="left"/>
     </w:lvl>
-    <w:lvl w:ilvl="8" w:tplc="0C1E4F2E">
+    <w:lvl w:ilvl="8" w:tplc="DB20FCB6">
       <w:numFmt w:val="decimal"/>
       <w:lvlText w:val=""/>
       <w:lvlJc w:val="left"/>
     </w:lvl>
   </w:abstractNum>
   <w:abstractNum w:abstractNumId="1" w15:restartNumberingAfterBreak="0">
-    <w:nsid w:val="41A51023"/>
+    <w:nsid w:val="196D2F34"/>
     <w:multiLevelType w:val="hybridMultilevel"/>
-    <w:tmpl w:val="96D289D8"/>
-    <w:lvl w:ilvl="0" w:tplc="BA724CF2">
+    <w:tmpl w:val="40FA0F18"/>
+    <w:lvl w:ilvl="0" w:tplc="546C44B0">
       <w:start w:val="1"/>
       <w:numFmt w:val="decimal"/>
       <w:lvlText w:val="%1."/>
@@ -26405,52 +27504,52 @@
         <w:ind w:left="567" w:hanging="340"/>
       </w:pPr>
     </w:lvl>
-    <w:lvl w:ilvl="1" w:tplc="7700A5A4">
+    <w:lvl w:ilvl="1" w:tplc="9D80B456">
       <w:numFmt w:val="decimal"/>
       <w:lvlText w:val=""/>
       <w:lvlJc w:val="left"/>
     </w:lvl>
-    <w:lvl w:ilvl="2" w:tplc="14D449F6">
+    <w:lvl w:ilvl="2" w:tplc="D0DAE9F0">
       <w:numFmt w:val="decimal"/>
       <w:lvlText w:val=""/>
       <w:lvlJc w:val="left"/>
     </w:lvl>
-    <w:lvl w:ilvl="3" w:tplc="ED882E88">
+    <w:lvl w:ilvl="3" w:tplc="3A9E5144">
       <w:numFmt w:val="decimal"/>
       <w:lvlText w:val=""/>
       <w:lvlJc w:val="left"/>
     </w:lvl>
-    <w:lvl w:ilvl="4" w:tplc="91D8AE82">
+    <w:lvl w:ilvl="4" w:tplc="1F242178">
       <w:numFmt w:val="decimal"/>
       <w:lvlText w:val=""/>
       <w:lvlJc w:val="left"/>
     </w:lvl>
-    <w:lvl w:ilvl="5" w:tplc="5148BFC6">
+    <w:lvl w:ilvl="5" w:tplc="5150F380">
       <w:numFmt w:val="decimal"/>
       <w:lvlText w:val=""/>
       <w:lvlJc w:val="left"/>
     </w:lvl>
-    <w:lvl w:ilvl="6" w:tplc="9634B4A2">
+    <w:lvl w:ilvl="6" w:tplc="3028C64C">
       <w:numFmt w:val="decimal"/>
       <w:lvlText w:val=""/>
       <w:lvlJc w:val="left"/>
     </w:lvl>
-    <w:lvl w:ilvl="7" w:tplc="45D2D53E">
+    <w:lvl w:ilvl="7" w:tplc="FC34E764">
       <w:numFmt w:val="decimal"/>
       <w:lvlText w:val=""/>
       <w:lvlJc w:val="left"/>
     </w:lvl>
-    <w:lvl w:ilvl="8" w:tplc="58342F92">
+    <w:lvl w:ilvl="8" w:tplc="87EA9CF8">
       <w:numFmt w:val="decimal"/>
       <w:lvlText w:val=""/>
       <w:lvlJc w:val="left"/>
     </w:lvl>
   </w:abstractNum>
   <w:abstractNum w:abstractNumId="2" w15:restartNumberingAfterBreak="0">
-    <w:nsid w:val="59B06F8F"/>
+    <w:nsid w:val="4EEB6489"/>
     <w:multiLevelType w:val="hybridMultilevel"/>
-    <w:tmpl w:val="4DFC2928"/>
-    <w:lvl w:ilvl="0" w:tplc="4C723A04">
+    <w:tmpl w:val="1D2C984E"/>
+    <w:lvl w:ilvl="0" w:tplc="55C4A6F6">
       <w:start w:val="1"/>
       <w:numFmt w:val="bullet"/>
       <w:lvlText w:val="●"/>
@@ -26459,7 +27558,7 @@
         <w:ind w:left="720" w:hanging="360"/>
       </w:pPr>
     </w:lvl>
-    <w:lvl w:ilvl="1" w:tplc="25544D2A">
+    <w:lvl w:ilvl="1" w:tplc="AFACDABE">
       <w:start w:val="1"/>
       <w:numFmt w:val="bullet"/>
       <w:lvlText w:val="○"/>
@@ -26468,7 +27567,7 @@
         <w:ind w:left="1440" w:hanging="360"/>
       </w:pPr>
     </w:lvl>
-    <w:lvl w:ilvl="2" w:tplc="C75A72CC">
+    <w:lvl w:ilvl="2" w:tplc="510EDA7C">
       <w:start w:val="1"/>
       <w:numFmt w:val="bullet"/>
       <w:lvlText w:val="■"/>
@@ -26477,7 +27576,7 @@
         <w:ind w:left="2160" w:hanging="360"/>
       </w:pPr>
     </w:lvl>
-    <w:lvl w:ilvl="3" w:tplc="6F5A4782">
+    <w:lvl w:ilvl="3" w:tplc="51468510">
       <w:start w:val="1"/>
       <w:numFmt w:val="bullet"/>
       <w:lvlText w:val="●"/>
@@ -26486,7 +27585,7 @@
         <w:ind w:left="2880" w:hanging="360"/>
       </w:pPr>
     </w:lvl>
-    <w:lvl w:ilvl="4" w:tplc="B5806732">
+    <w:lvl w:ilvl="4" w:tplc="5CDE0C16">
       <w:start w:val="1"/>
       <w:numFmt w:val="bullet"/>
       <w:lvlText w:val="○"/>
@@ -26495,7 +27594,7 @@
         <w:ind w:left="3600" w:hanging="360"/>
       </w:pPr>
     </w:lvl>
-    <w:lvl w:ilvl="5" w:tplc="83442696">
+    <w:lvl w:ilvl="5" w:tplc="FBA0DF18">
       <w:start w:val="1"/>
       <w:numFmt w:val="bullet"/>
       <w:lvlText w:val="■"/>
@@ -26504,7 +27603,7 @@
         <w:ind w:left="4320" w:hanging="360"/>
       </w:pPr>
     </w:lvl>
-    <w:lvl w:ilvl="6" w:tplc="B4B4E5F6">
+    <w:lvl w:ilvl="6" w:tplc="39502EB8">
       <w:start w:val="1"/>
       <w:numFmt w:val="bullet"/>
       <w:lvlText w:val="●"/>
@@ -26513,7 +27612,7 @@
         <w:ind w:left="5040" w:hanging="360"/>
       </w:pPr>
     </w:lvl>
-    <w:lvl w:ilvl="7" w:tplc="92428E0C">
+    <w:lvl w:ilvl="7" w:tplc="935A4EBC">
       <w:start w:val="1"/>
       <w:numFmt w:val="bullet"/>
       <w:lvlText w:val="●"/>
@@ -26522,7 +27621,7 @@
         <w:ind w:left="5760" w:hanging="360"/>
       </w:pPr>
     </w:lvl>
-    <w:lvl w:ilvl="8" w:tplc="D186B88E">
+    <w:lvl w:ilvl="8" w:tplc="F1B68DE0">
       <w:start w:val="1"/>
       <w:numFmt w:val="bullet"/>
       <w:lvlText w:val="●"/>
@@ -26532,25 +27631,25 @@
       </w:pPr>
     </w:lvl>
   </w:abstractNum>
-  <w:num w:numId="1" w16cid:durableId="232155659">
+  <w:num w:numId="1" w16cid:durableId="162670040">
     <w:abstractNumId w:val="2"/>
     <w:lvlOverride w:ilvl="0">
       <w:startOverride w:val="1"/>
     </w:lvlOverride>
   </w:num>
-  <w:num w:numId="2" w16cid:durableId="525758164">
+  <w:num w:numId="2" w16cid:durableId="794833424">
     <w:abstractNumId w:val="0"/>
     <w:lvlOverride w:ilvl="0">
       <w:startOverride w:val="1"/>
     </w:lvlOverride>
   </w:num>
-  <w:num w:numId="3" w16cid:durableId="1423184616">
+  <w:num w:numId="3" w16cid:durableId="145316140">
     <w:abstractNumId w:val="1"/>
     <w:lvlOverride w:ilvl="0">
       <w:startOverride w:val="1"/>
     </w:lvlOverride>
   </w:num>
-  <w:num w:numId="4" w16cid:durableId="1587181288">
+  <w:num w:numId="4" w16cid:durableId="1873416058">
     <w:abstractNumId w:val="1"/>
     <w:lvlOverride w:ilvl="0">
       <w:startOverride w:val="1"/>
@@ -27140,7 +28239,7 @@
     <w:autoRedefine/>
     <w:uiPriority w:val="39"/>
     <w:unhideWhenUsed/>
-    <w:rsid w:val="0069409A"/>
+    <w:rsid w:val="002168F4"/>
     <w:pPr>
       <w:spacing w:after="100"/>
     </w:pPr>
@@ -27152,7 +28251,7 @@
     <w:autoRedefine/>
     <w:uiPriority w:val="39"/>
     <w:unhideWhenUsed/>
-    <w:rsid w:val="0069409A"/>
+    <w:rsid w:val="002168F4"/>
     <w:pPr>
       <w:spacing w:after="100"/>
       <w:ind w:left="220"/>

</xml_diff>